<commit_message>
small corrections in training dataset
</commit_message>
<xml_diff>
--- a/training/MSR_framework_training_ES.docx
+++ b/training/MSR_framework_training_ES.docx
@@ -3371,7 +3371,7 @@
           <w:i/>
           <w:iCs/>
           <w:color w:val="808080" w:themeColor="background1" w:themeShade="80"/>
-          <w:lang w:val="es-EC"/>
+          <w:lang w:val="en-GB"/>
         </w:rPr>
       </w:pPr>
       <w:proofErr w:type="spellStart"/>
@@ -3381,7 +3381,7 @@
           <w:i/>
           <w:iCs/>
           <w:color w:val="808080" w:themeColor="background1" w:themeShade="80"/>
-          <w:lang w:val="es-EC"/>
+          <w:lang w:val="en-GB"/>
         </w:rPr>
         <w:t>c</w:t>
       </w:r>
@@ -3391,7 +3391,7 @@
           <w:i/>
           <w:iCs/>
           <w:color w:val="808080" w:themeColor="background1" w:themeShade="80"/>
-          <w:lang w:val="es-EC"/>
+          <w:lang w:val="en-GB"/>
         </w:rPr>
         <w:t>onda</w:t>
       </w:r>
@@ -3402,9 +3402,9 @@
           <w:i/>
           <w:iCs/>
           <w:color w:val="808080" w:themeColor="background1" w:themeShade="80"/>
-          <w:lang w:val="es-EC"/>
-        </w:rPr>
-        <w:t xml:space="preserve"> </w:t>
+          <w:lang w:val="en-GB"/>
+        </w:rPr>
+        <w:t xml:space="preserve"> env create -f </w:t>
       </w:r>
       <w:proofErr w:type="spellStart"/>
       <w:r>
@@ -3413,43 +3413,42 @@
           <w:i/>
           <w:iCs/>
           <w:color w:val="808080" w:themeColor="background1" w:themeShade="80"/>
-          <w:lang w:val="es-EC"/>
-        </w:rPr>
-        <w:t>env</w:t>
-      </w:r>
-      <w:proofErr w:type="spellEnd"/>
+          <w:lang w:val="en-GB"/>
+        </w:rPr>
+        <w:t>mrs_env_up</w:t>
+      </w:r>
       <w:r>
         <w:rPr>
           <w:rFonts w:ascii="Garamond" w:hAnsi="Garamond"/>
           <w:i/>
           <w:iCs/>
           <w:color w:val="808080" w:themeColor="background1" w:themeShade="80"/>
-          <w:lang w:val="es-EC"/>
-        </w:rPr>
-        <w:t xml:space="preserve"> </w:t>
-      </w:r>
-      <w:proofErr w:type="spellStart"/>
+          <w:lang w:val="en-GB"/>
+        </w:rPr>
+        <w:t>date</w:t>
+      </w:r>
       <w:r>
         <w:rPr>
           <w:rFonts w:ascii="Garamond" w:hAnsi="Garamond"/>
           <w:i/>
           <w:iCs/>
           <w:color w:val="808080" w:themeColor="background1" w:themeShade="80"/>
-          <w:lang w:val="es-EC"/>
-        </w:rPr>
-        <w:t>create</w:t>
+          <w:lang w:val="en-GB"/>
+        </w:rPr>
+        <w:t>.yaml</w:t>
       </w:r>
       <w:proofErr w:type="spellEnd"/>
-      <w:r>
+    </w:p>
+    <w:p>
+      <w:pPr>
         <w:rPr>
           <w:rFonts w:ascii="Garamond" w:hAnsi="Garamond"/>
           <w:i/>
           <w:iCs/>
           <w:color w:val="808080" w:themeColor="background1" w:themeShade="80"/>
-          <w:lang w:val="es-EC"/>
-        </w:rPr>
-        <w:t xml:space="preserve"> -f </w:t>
-      </w:r>
+          <w:lang w:val="en-GB"/>
+        </w:rPr>
+      </w:pPr>
       <w:proofErr w:type="spellStart"/>
       <w:r>
         <w:rPr>
@@ -3457,9 +3456,9 @@
           <w:i/>
           <w:iCs/>
           <w:color w:val="808080" w:themeColor="background1" w:themeShade="80"/>
-          <w:lang w:val="es-EC"/>
-        </w:rPr>
-        <w:t>msr_environment</w:t>
+          <w:lang w:val="en-GB"/>
+        </w:rPr>
+        <w:t>c</w:t>
       </w:r>
       <w:r>
         <w:rPr>
@@ -3467,22 +3466,21 @@
           <w:i/>
           <w:iCs/>
           <w:color w:val="808080" w:themeColor="background1" w:themeShade="80"/>
-          <w:lang w:val="es-EC"/>
-        </w:rPr>
-        <w:t>.yaml</w:t>
+          <w:lang w:val="en-GB"/>
+        </w:rPr>
+        <w:t>onda</w:t>
       </w:r>
       <w:proofErr w:type="spellEnd"/>
-    </w:p>
-    <w:p>
-      <w:pPr>
+      <w:r>
         <w:rPr>
           <w:rFonts w:ascii="Garamond" w:hAnsi="Garamond"/>
           <w:i/>
           <w:iCs/>
           <w:color w:val="808080" w:themeColor="background1" w:themeShade="80"/>
-          <w:lang w:val="es-EC"/>
-        </w:rPr>
-      </w:pPr>
+          <w:lang w:val="en-GB"/>
+        </w:rPr>
+        <w:t xml:space="preserve"> activate </w:t>
+      </w:r>
       <w:proofErr w:type="spellStart"/>
       <w:r>
         <w:rPr>
@@ -3490,9 +3488,9 @@
           <w:i/>
           <w:iCs/>
           <w:color w:val="808080" w:themeColor="background1" w:themeShade="80"/>
-          <w:lang w:val="es-EC"/>
-        </w:rPr>
-        <w:t>c</w:t>
+          <w:lang w:val="en-GB"/>
+        </w:rPr>
+        <w:t>mrs_env</w:t>
       </w:r>
       <w:r>
         <w:rPr>
@@ -3500,61 +3498,27 @@
           <w:i/>
           <w:iCs/>
           <w:color w:val="808080" w:themeColor="background1" w:themeShade="80"/>
-          <w:lang w:val="es-EC"/>
-        </w:rPr>
-        <w:t>onda</w:t>
-      </w:r>
-      <w:proofErr w:type="spellEnd"/>
+          <w:lang w:val="en-GB"/>
+        </w:rPr>
+        <w:t>_up</w:t>
+      </w:r>
       <w:r>
         <w:rPr>
           <w:rFonts w:ascii="Garamond" w:hAnsi="Garamond"/>
           <w:i/>
           <w:iCs/>
           <w:color w:val="808080" w:themeColor="background1" w:themeShade="80"/>
-          <w:lang w:val="es-EC"/>
-        </w:rPr>
-        <w:t xml:space="preserve"> </w:t>
-      </w:r>
-      <w:proofErr w:type="spellStart"/>
-      <w:r>
-        <w:rPr>
-          <w:rFonts w:ascii="Garamond" w:hAnsi="Garamond"/>
-          <w:i/>
-          <w:iCs/>
-          <w:color w:val="808080" w:themeColor="background1" w:themeShade="80"/>
-          <w:lang w:val="es-EC"/>
-        </w:rPr>
-        <w:t>activate</w:t>
+          <w:lang w:val="en-GB"/>
+        </w:rPr>
+        <w:t>date</w:t>
       </w:r>
       <w:proofErr w:type="spellEnd"/>
-      <w:r>
-        <w:rPr>
-          <w:rFonts w:ascii="Garamond" w:hAnsi="Garamond"/>
-          <w:i/>
-          <w:iCs/>
-          <w:color w:val="808080" w:themeColor="background1" w:themeShade="80"/>
-          <w:lang w:val="es-EC"/>
-        </w:rPr>
-        <w:t xml:space="preserve"> </w:t>
-      </w:r>
-      <w:proofErr w:type="spellStart"/>
-      <w:r>
-        <w:rPr>
-          <w:rFonts w:ascii="Garamond" w:hAnsi="Garamond"/>
-          <w:i/>
-          <w:iCs/>
-          <w:color w:val="808080" w:themeColor="background1" w:themeShade="80"/>
-          <w:lang w:val="es-EC"/>
-        </w:rPr>
-        <w:t>mrs_env</w:t>
-      </w:r>
-      <w:proofErr w:type="spellEnd"/>
-    </w:p>
-    <w:p>
-      <w:pPr>
-        <w:rPr>
-          <w:rFonts w:ascii="Garamond" w:hAnsi="Garamond"/>
-          <w:lang w:val="es-EC"/>
+    </w:p>
+    <w:p>
+      <w:pPr>
+        <w:rPr>
+          <w:rFonts w:ascii="Garamond" w:hAnsi="Garamond"/>
+          <w:lang w:val="en-GB"/>
         </w:rPr>
       </w:pPr>
     </w:p>
@@ -7497,7 +7461,7 @@
         </w:rPr>
         <w:lastRenderedPageBreak/>
         <w:drawing>
-          <wp:inline distT="0" distB="0" distL="0" distR="0" wp14:anchorId="5D2A6092" wp14:editId="4F4DC370">
+          <wp:inline distT="0" distB="0" distL="0" distR="0" wp14:anchorId="5D2A6092" wp14:editId="27432EEF">
             <wp:extent cx="5725795" cy="2320925"/>
             <wp:effectExtent l="0" t="0" r="8255" b="3175"/>
             <wp:docPr id="872326584" name="Picture 2"/>
@@ -8073,7 +8037,7 @@
           <w:lang w:val="es-EC"/>
         </w:rPr>
         <w:drawing>
-          <wp:inline distT="0" distB="0" distL="0" distR="0" wp14:anchorId="7DF1563D" wp14:editId="47CAEF5E">
+          <wp:inline distT="0" distB="0" distL="0" distR="0" wp14:anchorId="7DF1563D" wp14:editId="6CFC5484">
             <wp:extent cx="4923692" cy="2074427"/>
             <wp:effectExtent l="0" t="0" r="0" b="2540"/>
             <wp:docPr id="2075218623" name="Picture 3"/>
@@ -10608,7 +10572,7 @@
           <w:lang w:val="es-EC"/>
         </w:rPr>
         <w:drawing>
-          <wp:inline distT="0" distB="0" distL="0" distR="0" wp14:anchorId="3C266C2A" wp14:editId="66FE608D">
+          <wp:inline distT="0" distB="0" distL="0" distR="0" wp14:anchorId="3C266C2A" wp14:editId="4AFD2835">
             <wp:extent cx="3416300" cy="2271095"/>
             <wp:effectExtent l="0" t="0" r="0" b="0"/>
             <wp:docPr id="1712662771" name="Picture 18"/>
@@ -12419,7 +12383,7 @@
           <w:lang w:val="es-EC"/>
         </w:rPr>
         <w:drawing>
-          <wp:inline distT="0" distB="0" distL="0" distR="0" wp14:anchorId="4D499EA3" wp14:editId="49A8ACEA">
+          <wp:inline distT="0" distB="0" distL="0" distR="0" wp14:anchorId="4D499EA3" wp14:editId="44389D73">
             <wp:extent cx="3435914" cy="2381250"/>
             <wp:effectExtent l="0" t="0" r="0" b="0"/>
             <wp:docPr id="1429674699" name="Picture 19"/>
@@ -12959,7 +12923,7 @@
         </w:rPr>
         <w:lastRenderedPageBreak/>
         <w:drawing>
-          <wp:inline distT="0" distB="0" distL="0" distR="0" wp14:anchorId="00F48468" wp14:editId="3C23EF86">
+          <wp:inline distT="0" distB="0" distL="0" distR="0" wp14:anchorId="00F48468" wp14:editId="765C0BAB">
             <wp:extent cx="3363402" cy="2235930"/>
             <wp:effectExtent l="0" t="0" r="8890" b="0"/>
             <wp:docPr id="1170893738" name="Picture 21"/>
@@ -17401,7 +17365,7 @@
           <w:lang w:val="es-EC"/>
         </w:rPr>
         <w:drawing>
-          <wp:inline distT="0" distB="0" distL="0" distR="0" wp14:anchorId="67B731F2" wp14:editId="176C9885">
+          <wp:inline distT="0" distB="0" distL="0" distR="0" wp14:anchorId="67B731F2" wp14:editId="25C7A044">
             <wp:extent cx="5725160" cy="2305685"/>
             <wp:effectExtent l="0" t="0" r="8890" b="0"/>
             <wp:docPr id="1945377732" name="Picture 5"/>
@@ -17723,35 +17687,7 @@
           <w:rFonts w:ascii="Garamond" w:hAnsi="Garamond"/>
           <w:lang w:val="es-EC"/>
         </w:rPr>
-        <w:t xml:space="preserve"> los demás en cero, para ejecutar el </w:t>
-      </w:r>
-      <w:r>
-        <w:rPr>
-          <w:rFonts w:ascii="Garamond" w:hAnsi="Garamond"/>
-          <w:lang w:val="es-EC"/>
-        </w:rPr>
-        <w:t>G</w:t>
-      </w:r>
-      <w:r>
-        <w:rPr>
-          <w:rFonts w:ascii="Garamond" w:hAnsi="Garamond"/>
-          <w:lang w:val="es-EC"/>
-        </w:rPr>
-        <w:t xml:space="preserve">enerador de perfiles para </w:t>
-      </w:r>
-      <w:r>
-        <w:rPr>
-          <w:rFonts w:ascii="Garamond" w:hAnsi="Garamond"/>
-          <w:lang w:val="es-EC"/>
-        </w:rPr>
-        <w:t>la energía eólica</w:t>
-      </w:r>
-      <w:r>
-        <w:rPr>
-          <w:rFonts w:ascii="Garamond" w:hAnsi="Garamond"/>
-          <w:lang w:val="es-EC"/>
-        </w:rPr>
-        <w:t>.</w:t>
+        <w:t xml:space="preserve"> los demás en cero, para ejecutar el Generador de perfiles para la energía eólica.</w:t>
       </w:r>
     </w:p>
     <w:p>
@@ -17814,21 +17750,7 @@
           <w:rFonts w:ascii="Garamond" w:hAnsi="Garamond"/>
           <w:lang w:val="es-EC"/>
         </w:rPr>
-        <w:t>Estable</w:t>
-      </w:r>
-      <w:r>
-        <w:rPr>
-          <w:rFonts w:ascii="Garamond" w:hAnsi="Garamond"/>
-          <w:lang w:val="es-EC"/>
-        </w:rPr>
-        <w:t>zca</w:t>
-      </w:r>
-      <w:r>
-        <w:rPr>
-          <w:rFonts w:ascii="Garamond" w:hAnsi="Garamond"/>
-          <w:lang w:val="es-EC"/>
-        </w:rPr>
-        <w:t xml:space="preserve"> los años que se van a analizar en </w:t>
+        <w:t xml:space="preserve">Establezca los años que se van a analizar en </w:t>
       </w:r>
       <w:proofErr w:type="spellStart"/>
       <w:r>
@@ -17887,22 +17809,14 @@
           <w:szCs w:val="22"/>
           <w:lang w:val="es-EC"/>
         </w:rPr>
-        <w:instrText xml:space="preserve"> REF _Ref236048587 \h </w:instrText>
-      </w:r>
-      <w:r>
-        <w:rPr>
-          <w:rFonts w:ascii="Garamond" w:hAnsi="Garamond"/>
-          <w:szCs w:val="22"/>
-          <w:lang w:val="es-EC"/>
-        </w:rPr>
-      </w:r>
-      <w:r>
-        <w:rPr>
-          <w:rFonts w:ascii="Garamond" w:hAnsi="Garamond"/>
-          <w:szCs w:val="22"/>
-          <w:lang w:val="es-EC"/>
-        </w:rPr>
-        <w:instrText xml:space="preserve"> \* MERGEFORMAT </w:instrText>
+        <w:instrText xml:space="preserve"> REF _Ref236048587 \h  \* MERGEFORMAT </w:instrText>
+      </w:r>
+      <w:r>
+        <w:rPr>
+          <w:rFonts w:ascii="Garamond" w:hAnsi="Garamond"/>
+          <w:szCs w:val="22"/>
+          <w:lang w:val="es-EC"/>
+        </w:rPr>
       </w:r>
       <w:r>
         <w:rPr>
@@ -18198,34 +18112,7 @@
           <w:szCs w:val="18"/>
           <w:lang w:val="es-EC"/>
         </w:rPr>
-        <w:t>: Especificación de</w:t>
-      </w:r>
-      <w:r>
-        <w:rPr>
-          <w:rFonts w:ascii="Garamond" w:hAnsi="Garamond"/>
-          <w:sz w:val="18"/>
-          <w:szCs w:val="18"/>
-          <w:lang w:val="es-EC"/>
-        </w:rPr>
-        <w:t xml:space="preserve"> los parámetros del </w:t>
-      </w:r>
-      <w:r>
-        <w:rPr>
-          <w:rFonts w:ascii="Garamond" w:hAnsi="Garamond"/>
-          <w:sz w:val="18"/>
-          <w:szCs w:val="18"/>
-          <w:lang w:val="es-EC"/>
-        </w:rPr>
-        <w:t>G</w:t>
-      </w:r>
-      <w:r>
-        <w:rPr>
-          <w:rFonts w:ascii="Garamond" w:hAnsi="Garamond"/>
-          <w:sz w:val="18"/>
-          <w:szCs w:val="18"/>
-          <w:lang w:val="es-EC"/>
-        </w:rPr>
-        <w:t xml:space="preserve">enerador de perfiles en el </w:t>
+        <w:t xml:space="preserve">: Especificación de los parámetros del Generador de perfiles en el </w:t>
       </w:r>
       <w:bookmarkStart w:id="34" w:name="_Ref235888468"/>
       <w:r>
@@ -18693,49 +18580,7 @@
           <w:rFonts w:ascii="Garamond" w:hAnsi="Garamond"/>
           <w:lang w:val="es-EC"/>
         </w:rPr>
-        <w:t xml:space="preserve"> los mensajes de registro en la terminal para supervisar el avance del flujo de trabajo. El script informa </w:t>
-      </w:r>
-      <w:r>
-        <w:rPr>
-          <w:rFonts w:ascii="Garamond" w:hAnsi="Garamond"/>
-          <w:lang w:val="es-EC"/>
-        </w:rPr>
-        <w:t xml:space="preserve">sobre </w:t>
-      </w:r>
-      <w:r>
-        <w:rPr>
-          <w:rFonts w:ascii="Garamond" w:hAnsi="Garamond"/>
-          <w:lang w:val="es-EC"/>
-        </w:rPr>
-        <w:t>la región activa, la tecnología</w:t>
-      </w:r>
-      <w:r>
-        <w:rPr>
-          <w:rFonts w:ascii="Garamond" w:hAnsi="Garamond"/>
-          <w:lang w:val="es-EC"/>
-        </w:rPr>
-        <w:t xml:space="preserve"> activa,</w:t>
-      </w:r>
-      <w:r>
-        <w:rPr>
-          <w:rFonts w:ascii="Garamond" w:hAnsi="Garamond"/>
-          <w:lang w:val="es-EC"/>
-        </w:rPr>
-        <w:t xml:space="preserve"> y la etapa del flujo de trabajo. La ejecución se da por concluida cuando apare</w:t>
-      </w:r>
-      <w:r>
-        <w:rPr>
-          <w:rFonts w:ascii="Garamond" w:hAnsi="Garamond"/>
-          <w:lang w:val="es-EC"/>
-        </w:rPr>
-        <w:t>zca</w:t>
-      </w:r>
-      <w:r>
-        <w:rPr>
-          <w:rFonts w:ascii="Garamond" w:hAnsi="Garamond"/>
-          <w:lang w:val="es-EC"/>
-        </w:rPr>
-        <w:t xml:space="preserve"> en la terminal el mensaje </w:t>
+        <w:t xml:space="preserve"> los mensajes de registro en la terminal para supervisar el avance del flujo de trabajo. El script informa sobre la región activa, la tecnología activa, y la etapa del flujo de trabajo. La ejecución se da por concluida cuando aparezca en la terminal el mensaje </w:t>
       </w:r>
       <w:r>
         <w:rPr>
@@ -18820,14 +18665,7 @@
           <w:rFonts w:ascii="Garamond" w:hAnsi="Garamond"/>
           <w:lang w:val="es-EC"/>
         </w:rPr>
-        <w:t xml:space="preserve">” </w:t>
-      </w:r>
-      <w:r>
-        <w:rPr>
-          <w:rFonts w:ascii="Garamond" w:hAnsi="Garamond"/>
-          <w:lang w:val="es-EC"/>
-        </w:rPr>
-        <w:t>(“</w:t>
+        <w:t>” (“</w:t>
       </w:r>
       <w:r>
         <w:rPr>
@@ -18914,32 +18752,20 @@
           <w:color w:val="00B050"/>
           <w:lang w:val="es-EC"/>
         </w:rPr>
-        <w:t>output</w:t>
-      </w:r>
-      <w:r>
-        <w:rPr>
-          <w:rFonts w:ascii="Garamond" w:hAnsi="Garamond"/>
-          <w:b/>
-          <w:bCs/>
+        <w:t>outputs</w:t>
+      </w:r>
+      <w:r>
+        <w:rPr>
+          <w:rFonts w:ascii="Garamond" w:hAnsi="Garamond"/>
+          <w:lang w:val="es-EC"/>
+        </w:rPr>
+        <w:t xml:space="preserve">, el script crea una carpeta llamada </w:t>
+      </w:r>
+      <w:r>
+        <w:rPr>
+          <w:rFonts w:ascii="Garamond" w:hAnsi="Garamond"/>
           <w:i/>
           <w:iCs/>
-          <w:color w:val="00B050"/>
-          <w:lang w:val="es-EC"/>
-        </w:rPr>
-        <w:t>s</w:t>
-      </w:r>
-      <w:r>
-        <w:rPr>
-          <w:rFonts w:ascii="Garamond" w:hAnsi="Garamond"/>
-          <w:lang w:val="es-EC"/>
-        </w:rPr>
-        <w:t xml:space="preserve">, el script crea una carpeta llamada </w:t>
-      </w:r>
-      <w:r>
-        <w:rPr>
-          <w:rFonts w:ascii="Garamond" w:hAnsi="Garamond"/>
-          <w:i/>
-          <w:iCs/>
           <w:lang w:val="es-EC"/>
         </w:rPr>
         <w:t xml:space="preserve">2_profile_generator </w:t>
@@ -18989,22 +18815,14 @@
           <w:szCs w:val="22"/>
           <w:lang w:val="es-EC"/>
         </w:rPr>
-        <w:instrText xml:space="preserve"> REF _Ref236049025 \h </w:instrText>
-      </w:r>
-      <w:r>
-        <w:rPr>
-          <w:rFonts w:ascii="Garamond" w:hAnsi="Garamond"/>
-          <w:szCs w:val="22"/>
-          <w:lang w:val="es-EC"/>
-        </w:rPr>
-      </w:r>
-      <w:r>
-        <w:rPr>
-          <w:rFonts w:ascii="Garamond" w:hAnsi="Garamond"/>
-          <w:szCs w:val="22"/>
-          <w:lang w:val="es-EC"/>
-        </w:rPr>
-        <w:instrText xml:space="preserve"> \* MERGEFORMAT </w:instrText>
+        <w:instrText xml:space="preserve"> REF _Ref236049025 \h  \* MERGEFORMAT </w:instrText>
+      </w:r>
+      <w:r>
+        <w:rPr>
+          <w:rFonts w:ascii="Garamond" w:hAnsi="Garamond"/>
+          <w:szCs w:val="22"/>
+          <w:lang w:val="es-EC"/>
+        </w:rPr>
       </w:r>
       <w:r>
         <w:rPr>
@@ -19075,22 +18893,14 @@
           <w:szCs w:val="22"/>
           <w:lang w:val="es-EC"/>
         </w:rPr>
-        <w:instrText xml:space="preserve"> REF _Ref236049030 \h </w:instrText>
-      </w:r>
-      <w:r>
-        <w:rPr>
-          <w:rFonts w:ascii="Garamond" w:hAnsi="Garamond"/>
-          <w:szCs w:val="22"/>
-          <w:lang w:val="es-EC"/>
-        </w:rPr>
-      </w:r>
-      <w:r>
-        <w:rPr>
-          <w:rFonts w:ascii="Garamond" w:hAnsi="Garamond"/>
-          <w:szCs w:val="22"/>
-          <w:lang w:val="es-EC"/>
-        </w:rPr>
-        <w:instrText xml:space="preserve"> \* MERGEFORMAT </w:instrText>
+        <w:instrText xml:space="preserve"> REF _Ref236049030 \h  \* MERGEFORMAT </w:instrText>
+      </w:r>
+      <w:r>
+        <w:rPr>
+          <w:rFonts w:ascii="Garamond" w:hAnsi="Garamond"/>
+          <w:szCs w:val="22"/>
+          <w:lang w:val="es-EC"/>
+        </w:rPr>
       </w:r>
       <w:r>
         <w:rPr>
@@ -19311,34 +19121,7 @@
           <w:szCs w:val="18"/>
           <w:lang w:val="es-EC"/>
         </w:rPr>
-        <w:t xml:space="preserve">: </w:t>
-      </w:r>
-      <w:r>
-        <w:rPr>
-          <w:rFonts w:ascii="Garamond" w:hAnsi="Garamond"/>
-          <w:sz w:val="18"/>
-          <w:szCs w:val="18"/>
-          <w:lang w:val="es-EC"/>
-        </w:rPr>
-        <w:t xml:space="preserve">Ejemplos de perfiles del factor de capacidad diurno de la energía eólica por </w:t>
-      </w:r>
-      <w:r>
-        <w:rPr>
-          <w:rFonts w:ascii="Garamond" w:hAnsi="Garamond"/>
-          <w:sz w:val="18"/>
-          <w:szCs w:val="18"/>
-          <w:lang w:val="es-EC"/>
-        </w:rPr>
-        <w:t>mes</w:t>
-      </w:r>
-      <w:r>
-        <w:rPr>
-          <w:rFonts w:ascii="Garamond" w:hAnsi="Garamond"/>
-          <w:sz w:val="18"/>
-          <w:szCs w:val="18"/>
-          <w:lang w:val="es-EC"/>
-        </w:rPr>
-        <w:t xml:space="preserve"> </w:t>
+        <w:t xml:space="preserve">: Ejemplos de perfiles del factor de capacidad diurno de la energía eólica por mes </w:t>
       </w:r>
       <w:r>
         <w:rPr>
@@ -19374,25 +19157,7 @@
           <w:szCs w:val="18"/>
           <w:lang w:val="es-EC"/>
         </w:rPr>
-        <w:t xml:space="preserve"> </w:t>
-      </w:r>
-      <w:r>
-        <w:rPr>
-          <w:rFonts w:ascii="Garamond" w:hAnsi="Garamond"/>
-          <w:sz w:val="18"/>
-          <w:szCs w:val="18"/>
-          <w:lang w:val="es-EC"/>
-        </w:rPr>
-        <w:t>producidos por el G</w:t>
-      </w:r>
-      <w:r>
-        <w:rPr>
-          <w:rFonts w:ascii="Garamond" w:hAnsi="Garamond"/>
-          <w:sz w:val="18"/>
-          <w:szCs w:val="18"/>
-          <w:lang w:val="es-EC"/>
-        </w:rPr>
-        <w:t>enerador de perfiles.</w:t>
+        <w:t xml:space="preserve"> producidos por el Generador de perfiles.</w:t>
       </w:r>
     </w:p>
     <w:p>
@@ -19566,43 +19331,7 @@
           <w:szCs w:val="18"/>
           <w:lang w:val="es-EC"/>
         </w:rPr>
-        <w:t>Ejemplo de</w:t>
-      </w:r>
-      <w:r>
-        <w:rPr>
-          <w:rFonts w:ascii="Garamond" w:hAnsi="Garamond"/>
-          <w:sz w:val="18"/>
-          <w:szCs w:val="18"/>
-          <w:lang w:val="es-EC"/>
-        </w:rPr>
-        <w:t>l</w:t>
-      </w:r>
-      <w:r>
-        <w:rPr>
-          <w:rFonts w:ascii="Garamond" w:hAnsi="Garamond"/>
-          <w:sz w:val="18"/>
-          <w:szCs w:val="18"/>
-          <w:lang w:val="es-EC"/>
-        </w:rPr>
-        <w:t xml:space="preserve"> perfil del factor de capacidad estacional de la energía eólica </w:t>
-      </w:r>
-      <w:r>
-        <w:rPr>
-          <w:rFonts w:ascii="Garamond" w:hAnsi="Garamond"/>
-          <w:sz w:val="18"/>
-          <w:szCs w:val="18"/>
-          <w:lang w:val="es-EC"/>
-        </w:rPr>
-        <w:t>de las MSR,</w:t>
-      </w:r>
-      <w:r>
-        <w:rPr>
-          <w:rFonts w:ascii="Garamond" w:hAnsi="Garamond"/>
-          <w:sz w:val="18"/>
-          <w:szCs w:val="18"/>
-          <w:lang w:val="es-EC"/>
-        </w:rPr>
-        <w:t xml:space="preserve"> </w:t>
+        <w:t xml:space="preserve">Ejemplo del perfil del factor de capacidad estacional de la energía eólica de las MSR, </w:t>
       </w:r>
       <w:bookmarkStart w:id="38" w:name="_Ref235888946"/>
       <w:r>
@@ -19771,21 +19500,7 @@
           <w:rFonts w:ascii="Garamond" w:hAnsi="Garamond"/>
           <w:lang w:val="es-EC"/>
         </w:rPr>
-        <w:t xml:space="preserve">y </w:t>
-      </w:r>
-      <w:r>
-        <w:rPr>
-          <w:rFonts w:ascii="Garamond" w:hAnsi="Garamond"/>
-          <w:lang w:val="es-EC"/>
-        </w:rPr>
-        <w:t>establezca los demás en cero</w:t>
-      </w:r>
-      <w:r>
-        <w:rPr>
-          <w:rFonts w:ascii="Garamond" w:hAnsi="Garamond"/>
-          <w:lang w:val="es-EC"/>
-        </w:rPr>
-        <w:t>.</w:t>
+        <w:t>y establezca los demás en cero.</w:t>
       </w:r>
     </w:p>
     <w:p>
@@ -20222,21 +19937,7 @@
           <w:rFonts w:ascii="Garamond" w:hAnsi="Garamond"/>
           <w:lang w:val="es-EC"/>
         </w:rPr>
-        <w:t xml:space="preserve">El combinador de atributos determina, para cada MSR, los atributos de </w:t>
-      </w:r>
-      <w:r>
-        <w:rPr>
-          <w:rFonts w:ascii="Garamond" w:hAnsi="Garamond"/>
-          <w:lang w:val="es-EC"/>
-        </w:rPr>
-        <w:t>producción y costo</w:t>
-      </w:r>
-      <w:r>
-        <w:rPr>
-          <w:rFonts w:ascii="Garamond" w:hAnsi="Garamond"/>
-          <w:lang w:val="es-EC"/>
-        </w:rPr>
-        <w:t>, incluyendo los factores de capacidad anual ajustados por pérdidas y tres métricas del costo nivelado de la electricidad (LCOE</w:t>
+        <w:t>El combinador de atributos determina, para cada MSR, los atributos de producción y costo, incluyendo los factores de capacidad anual ajustados por pérdidas y tres métricas del costo nivelado de la electricidad (LCOE</w:t>
       </w:r>
       <w:r>
         <w:rPr>
@@ -20354,21 +20055,7 @@
           <w:rFonts w:ascii="Garamond" w:hAnsi="Garamond"/>
           <w:lang w:val="es-EC"/>
         </w:rPr>
-        <w:t>Abr</w:t>
-      </w:r>
-      <w:r>
-        <w:rPr>
-          <w:rFonts w:ascii="Garamond" w:hAnsi="Garamond"/>
-          <w:lang w:val="es-EC"/>
-        </w:rPr>
-        <w:t>a</w:t>
-      </w:r>
-      <w:r>
-        <w:rPr>
-          <w:rFonts w:ascii="Garamond" w:hAnsi="Garamond"/>
-          <w:lang w:val="es-EC"/>
-        </w:rPr>
-        <w:t xml:space="preserve"> el </w:t>
+        <w:t xml:space="preserve">Abra el </w:t>
       </w:r>
       <w:r>
         <w:rPr>
@@ -20546,23 +20233,7 @@
           <w:szCs w:val="22"/>
           <w:lang w:val="es-EC"/>
         </w:rPr>
-        <w:t>Indi</w:t>
-      </w:r>
-      <w:r>
-        <w:rPr>
-          <w:rFonts w:ascii="Garamond" w:hAnsi="Garamond"/>
-          <w:szCs w:val="22"/>
-          <w:lang w:val="es-EC"/>
-        </w:rPr>
-        <w:t>que</w:t>
-      </w:r>
-      <w:r>
-        <w:rPr>
-          <w:rFonts w:ascii="Garamond" w:hAnsi="Garamond"/>
-          <w:szCs w:val="22"/>
-          <w:lang w:val="es-EC"/>
-        </w:rPr>
-        <w:t xml:space="preserve"> las rutas a las carpetas </w:t>
+        <w:t xml:space="preserve">Indique las rutas a las carpetas </w:t>
       </w:r>
       <w:r>
         <w:rPr>
@@ -20622,31 +20293,7 @@
           <w:szCs w:val="22"/>
           <w:lang w:val="es-EC"/>
         </w:rPr>
-        <w:t xml:space="preserve">en las celdas correspondientes, tal como se </w:t>
-      </w:r>
-      <w:r>
-        <w:rPr>
-          <w:rFonts w:ascii="Garamond" w:hAnsi="Garamond"/>
-          <w:szCs w:val="22"/>
-          <w:lang w:val="es-EC"/>
-        </w:rPr>
-        <w:t>mostró</w:t>
-      </w:r>
-      <w:r>
-        <w:rPr>
-          <w:rFonts w:ascii="Garamond" w:hAnsi="Garamond"/>
-          <w:szCs w:val="22"/>
-          <w:lang w:val="es-EC"/>
-        </w:rPr>
-        <w:t xml:space="preserve"> en la</w:t>
-      </w:r>
-      <w:r>
-        <w:rPr>
-          <w:rFonts w:ascii="Garamond" w:hAnsi="Garamond"/>
-          <w:szCs w:val="22"/>
-          <w:lang w:val="es-EC"/>
-        </w:rPr>
-        <w:t xml:space="preserve"> </w:t>
+        <w:t xml:space="preserve">en las celdas correspondientes, tal como se mostró en la </w:t>
       </w:r>
       <w:r>
         <w:rPr>
@@ -20662,22 +20309,14 @@
           <w:szCs w:val="22"/>
           <w:lang w:val="es-EC"/>
         </w:rPr>
-        <w:instrText xml:space="preserve"> REF _Ref235972775 \h </w:instrText>
-      </w:r>
-      <w:r>
-        <w:rPr>
-          <w:rFonts w:ascii="Garamond" w:hAnsi="Garamond"/>
-          <w:szCs w:val="22"/>
-          <w:lang w:val="es-EC"/>
-        </w:rPr>
-      </w:r>
-      <w:r>
-        <w:rPr>
-          <w:rFonts w:ascii="Garamond" w:hAnsi="Garamond"/>
-          <w:szCs w:val="22"/>
-          <w:lang w:val="es-EC"/>
-        </w:rPr>
-        <w:instrText xml:space="preserve"> \* MERGEFORMAT </w:instrText>
+        <w:instrText xml:space="preserve"> REF _Ref235972775 \h  \* MERGEFORMAT </w:instrText>
+      </w:r>
+      <w:r>
+        <w:rPr>
+          <w:rFonts w:ascii="Garamond" w:hAnsi="Garamond"/>
+          <w:szCs w:val="22"/>
+          <w:lang w:val="es-EC"/>
+        </w:rPr>
       </w:r>
       <w:r>
         <w:rPr>
@@ -20723,15 +20362,7 @@
           <w:szCs w:val="22"/>
           <w:lang w:val="es-EC"/>
         </w:rPr>
-        <w:t>.</w:t>
-      </w:r>
-      <w:r>
-        <w:rPr>
-          <w:rFonts w:ascii="Garamond" w:hAnsi="Garamond"/>
-          <w:szCs w:val="22"/>
-          <w:lang w:val="es-EC"/>
-        </w:rPr>
-        <w:t xml:space="preserve"> </w:t>
+        <w:t xml:space="preserve">. </w:t>
       </w:r>
     </w:p>
     <w:p>
@@ -20877,23 +20508,7 @@
           <w:szCs w:val="22"/>
           <w:lang w:val="es-EC"/>
         </w:rPr>
-        <w:t>. Los nombres de los archivos están ordenados correctamente. Cópi</w:t>
-      </w:r>
-      <w:r>
-        <w:rPr>
-          <w:rFonts w:ascii="Garamond" w:hAnsi="Garamond"/>
-          <w:szCs w:val="22"/>
-          <w:lang w:val="es-EC"/>
-        </w:rPr>
-        <w:t>e</w:t>
-      </w:r>
-      <w:r>
-        <w:rPr>
-          <w:rFonts w:ascii="Garamond" w:hAnsi="Garamond"/>
-          <w:szCs w:val="22"/>
-          <w:lang w:val="es-EC"/>
-        </w:rPr>
-        <w:t>los</w:t>
+        <w:t>. Los nombres de los archivos están ordenados correctamente. Cópielos</w:t>
       </w:r>
       <w:r>
         <w:rPr>
@@ -20990,22 +20605,14 @@
           <w:szCs w:val="22"/>
           <w:lang w:val="es-EC"/>
         </w:rPr>
-        <w:instrText xml:space="preserve"> REF _Ref236056854 \h </w:instrText>
-      </w:r>
-      <w:r>
-        <w:rPr>
-          <w:rFonts w:ascii="Garamond" w:hAnsi="Garamond"/>
-          <w:szCs w:val="22"/>
-          <w:lang w:val="es-EC"/>
-        </w:rPr>
-      </w:r>
-      <w:r>
-        <w:rPr>
-          <w:rFonts w:ascii="Garamond" w:hAnsi="Garamond"/>
-          <w:szCs w:val="22"/>
-          <w:lang w:val="es-EC"/>
-        </w:rPr>
-        <w:instrText xml:space="preserve"> \* MERGEFORMAT </w:instrText>
+        <w:instrText xml:space="preserve"> REF _Ref236056854 \h  \* MERGEFORMAT </w:instrText>
+      </w:r>
+      <w:r>
+        <w:rPr>
+          <w:rFonts w:ascii="Garamond" w:hAnsi="Garamond"/>
+          <w:szCs w:val="22"/>
+          <w:lang w:val="es-EC"/>
+        </w:rPr>
       </w:r>
       <w:r>
         <w:rPr>
@@ -21231,34 +20838,7 @@
           <w:szCs w:val="18"/>
           <w:lang w:val="es-EC"/>
         </w:rPr>
-        <w:t>Especificación de</w:t>
-      </w:r>
-      <w:r>
-        <w:rPr>
-          <w:rFonts w:ascii="Garamond" w:hAnsi="Garamond"/>
-          <w:sz w:val="18"/>
-          <w:szCs w:val="18"/>
-          <w:lang w:val="es-EC"/>
-        </w:rPr>
-        <w:t xml:space="preserve"> los conjuntos de datos de entrada para ejecutar el </w:t>
-      </w:r>
-      <w:r>
-        <w:rPr>
-          <w:rFonts w:ascii="Garamond" w:hAnsi="Garamond"/>
-          <w:sz w:val="18"/>
-          <w:szCs w:val="18"/>
-          <w:lang w:val="es-EC"/>
-        </w:rPr>
-        <w:t>Combinador de atributos</w:t>
-      </w:r>
-      <w:r>
-        <w:rPr>
-          <w:rFonts w:ascii="Garamond" w:hAnsi="Garamond"/>
-          <w:sz w:val="18"/>
-          <w:szCs w:val="18"/>
-          <w:lang w:val="es-EC"/>
-        </w:rPr>
-        <w:t xml:space="preserve"> en el </w:t>
+        <w:t xml:space="preserve">Especificación de los conjuntos de datos de entrada para ejecutar el Combinador de atributos en el </w:t>
       </w:r>
       <w:r>
         <w:rPr>
@@ -21406,21 +20986,7 @@
           <w:rFonts w:ascii="Garamond" w:hAnsi="Garamond"/>
           <w:lang w:val="es-EC"/>
         </w:rPr>
-        <w:t>Para la primera ejecución, configur</w:t>
-      </w:r>
-      <w:r>
-        <w:rPr>
-          <w:rFonts w:ascii="Garamond" w:hAnsi="Garamond"/>
-          <w:lang w:val="es-EC"/>
-        </w:rPr>
-        <w:t>e</w:t>
-      </w:r>
-      <w:r>
-        <w:rPr>
-          <w:rFonts w:ascii="Garamond" w:hAnsi="Garamond"/>
-          <w:lang w:val="es-EC"/>
-        </w:rPr>
-        <w:t xml:space="preserve"> el parámetro </w:t>
+        <w:t xml:space="preserve">Para la primera ejecución, configure el parámetro </w:t>
       </w:r>
       <w:proofErr w:type="spellStart"/>
       <w:r>
@@ -21439,28 +21005,7 @@
           <w:rFonts w:ascii="Garamond" w:hAnsi="Garamond"/>
           <w:lang w:val="es-EC"/>
         </w:rPr>
-        <w:t xml:space="preserve"> en 1 y deshabilit</w:t>
-      </w:r>
-      <w:r>
-        <w:rPr>
-          <w:rFonts w:ascii="Garamond" w:hAnsi="Garamond"/>
-          <w:lang w:val="es-EC"/>
-        </w:rPr>
-        <w:t>e</w:t>
-      </w:r>
-      <w:r>
-        <w:rPr>
-          <w:rFonts w:ascii="Garamond" w:hAnsi="Garamond"/>
-          <w:lang w:val="es-EC"/>
-        </w:rPr>
-        <w:t xml:space="preserve"> las demás tecnologías. Habilit</w:t>
-      </w:r>
-      <w:r>
-        <w:rPr>
-          <w:rFonts w:ascii="Garamond" w:hAnsi="Garamond"/>
-          <w:lang w:val="es-EC"/>
-        </w:rPr>
-        <w:t xml:space="preserve">e </w:t>
+        <w:t xml:space="preserve"> en 1 y deshabilite las demás tecnologías. Habilite </w:t>
       </w:r>
       <w:proofErr w:type="spellStart"/>
       <w:r>
@@ -21489,42 +21034,7 @@
           <w:rFonts w:ascii="Garamond" w:hAnsi="Garamond"/>
           <w:lang w:val="es-EC"/>
         </w:rPr>
-        <w:t xml:space="preserve">para utilizar los perfiles </w:t>
-      </w:r>
-      <w:r>
-        <w:rPr>
-          <w:rFonts w:ascii="Garamond" w:hAnsi="Garamond"/>
-          <w:lang w:val="es-EC"/>
-        </w:rPr>
-        <w:t xml:space="preserve">temporales en </w:t>
-      </w:r>
-      <w:r>
-        <w:rPr>
-          <w:rFonts w:ascii="Garamond" w:hAnsi="Garamond"/>
-          <w:lang w:val="es-EC"/>
-        </w:rPr>
-        <w:t xml:space="preserve">hora local </w:t>
-      </w:r>
-      <w:r>
-        <w:rPr>
-          <w:rFonts w:ascii="Garamond" w:hAnsi="Garamond"/>
-          <w:lang w:val="es-EC"/>
-        </w:rPr>
-        <w:t>producidos</w:t>
-      </w:r>
-      <w:r>
-        <w:rPr>
-          <w:rFonts w:ascii="Garamond" w:hAnsi="Garamond"/>
-          <w:lang w:val="es-EC"/>
-        </w:rPr>
-        <w:t xml:space="preserve"> por el Generador de perfiles.</w:t>
-      </w:r>
-      <w:r>
-        <w:rPr>
-          <w:rFonts w:ascii="Garamond" w:hAnsi="Garamond"/>
-          <w:lang w:val="es-EC"/>
-        </w:rPr>
-        <w:t xml:space="preserve"> </w:t>
+        <w:t xml:space="preserve">para utilizar los perfiles temporales en hora local producidos por el Generador de perfiles. </w:t>
       </w:r>
     </w:p>
     <w:p>
@@ -21641,42 +21151,7 @@
           <w:rFonts w:ascii="Garamond" w:hAnsi="Garamond"/>
           <w:lang w:val="es-EC"/>
         </w:rPr>
-        <w:t>. Los parámetros están ordenados correctamente. Cópi</w:t>
-      </w:r>
-      <w:r>
-        <w:rPr>
-          <w:rFonts w:ascii="Garamond" w:hAnsi="Garamond"/>
-          <w:lang w:val="es-EC"/>
-        </w:rPr>
-        <w:t>e</w:t>
-      </w:r>
-      <w:r>
-        <w:rPr>
-          <w:rFonts w:ascii="Garamond" w:hAnsi="Garamond"/>
-          <w:lang w:val="es-EC"/>
-        </w:rPr>
-        <w:t xml:space="preserve">los </w:t>
-      </w:r>
-      <w:r>
-        <w:rPr>
-          <w:rFonts w:ascii="Garamond" w:hAnsi="Garamond"/>
-          <w:lang w:val="es-EC"/>
-        </w:rPr>
-        <w:t xml:space="preserve">y péguelos </w:t>
-      </w:r>
-      <w:r>
-        <w:rPr>
-          <w:rFonts w:ascii="Garamond" w:hAnsi="Garamond"/>
-          <w:lang w:val="es-EC"/>
-        </w:rPr>
-        <w:t xml:space="preserve">directamente en la columna </w:t>
-      </w:r>
-      <w:r>
-        <w:rPr>
-          <w:rFonts w:ascii="Garamond" w:hAnsi="Garamond"/>
-          <w:lang w:val="es-EC"/>
-        </w:rPr>
-        <w:t>“</w:t>
+        <w:t>. Los parámetros están ordenados correctamente. Cópielos y péguelos directamente en la columna “</w:t>
       </w:r>
       <w:proofErr w:type="spellStart"/>
       <w:r>
@@ -21694,14 +21169,7 @@
           <w:rFonts w:ascii="Garamond" w:hAnsi="Garamond"/>
           <w:lang w:val="es-EC"/>
         </w:rPr>
-        <w:t>”</w:t>
-      </w:r>
-      <w:r>
-        <w:rPr>
-          <w:rFonts w:ascii="Garamond" w:hAnsi="Garamond"/>
-          <w:lang w:val="es-EC"/>
-        </w:rPr>
-        <w:t xml:space="preserve"> del </w:t>
+        <w:t xml:space="preserve">” del </w:t>
       </w:r>
       <w:r>
         <w:rPr>
@@ -21721,21 +21189,14 @@
           <w:rFonts w:ascii="Garamond" w:hAnsi="Garamond"/>
           <w:lang w:val="es-EC"/>
         </w:rPr>
-        <w:t>.</w:t>
-      </w:r>
-      <w:r>
-        <w:rPr>
-          <w:rFonts w:ascii="Garamond" w:hAnsi="Garamond"/>
-          <w:lang w:val="es-EC"/>
-        </w:rPr>
-        <w:t xml:space="preserve"> </w:t>
-      </w:r>
-    </w:p>
-    <w:p>
-      <w:pPr>
-        <w:rPr>
-          <w:rFonts w:ascii="Garamond" w:hAnsi="Garamond"/>
-          <w:lang w:val="en-GB"/>
+        <w:t xml:space="preserve">. </w:t>
+      </w:r>
+    </w:p>
+    <w:p>
+      <w:pPr>
+        <w:rPr>
+          <w:rFonts w:ascii="Garamond" w:hAnsi="Garamond"/>
+          <w:lang w:val="es-ES"/>
         </w:rPr>
       </w:pPr>
     </w:p>
@@ -21910,7 +21371,7 @@
         <w:rPr>
           <w:rFonts w:ascii="Garamond" w:hAnsi="Garamond"/>
           <w:color w:val="FFC000"/>
-          <w:lang w:val="en-GB"/>
+          <w:lang w:val="es-ES"/>
         </w:rPr>
       </w:pPr>
       <w:r>
@@ -22184,7 +21645,7 @@
       <w:r>
         <w:rPr>
           <w:rFonts w:ascii="Garamond" w:hAnsi="Garamond"/>
-          <w:lang w:val="en-GB"/>
+          <w:lang w:val="es-ES"/>
         </w:rPr>
         <w:t xml:space="preserve"> </w:t>
       </w:r>
@@ -22193,7 +21654,7 @@
       <w:pPr>
         <w:rPr>
           <w:rFonts w:ascii="Garamond" w:hAnsi="Garamond"/>
-          <w:lang w:val="en-GB"/>
+          <w:lang w:val="es-ES"/>
         </w:rPr>
       </w:pPr>
     </w:p>
@@ -22296,25 +21757,7 @@
           <w:iCs/>
           <w:lang w:val="es-EC"/>
         </w:rPr>
-        <w:t xml:space="preserve">Flujo de trabajo del </w:t>
-      </w:r>
-      <w:r>
-        <w:rPr>
-          <w:rFonts w:ascii="Garamond" w:hAnsi="Garamond"/>
-          <w:i/>
-          <w:iCs/>
-          <w:lang w:val="es-EC"/>
-        </w:rPr>
-        <w:t>Combinador de atributos</w:t>
-      </w:r>
-      <w:r>
-        <w:rPr>
-          <w:rFonts w:ascii="Garamond" w:hAnsi="Garamond"/>
-          <w:i/>
-          <w:iCs/>
-          <w:lang w:val="es-EC"/>
-        </w:rPr>
-        <w:t xml:space="preserve"> completado</w:t>
+        <w:t>Flujo de trabajo del Combinador de atributos completado</w:t>
       </w:r>
       <w:r>
         <w:rPr>
@@ -22545,55 +21988,7 @@
           <w:szCs w:val="22"/>
           <w:lang w:val="es-EC"/>
         </w:rPr>
-        <w:t xml:space="preserve">La subcarpeta </w:t>
-      </w:r>
-      <w:r>
-        <w:rPr>
-          <w:rFonts w:ascii="Garamond" w:hAnsi="Garamond"/>
-          <w:szCs w:val="22"/>
-          <w:lang w:val="es-EC"/>
-        </w:rPr>
-        <w:t>regional</w:t>
-      </w:r>
-      <w:r>
-        <w:rPr>
-          <w:rFonts w:ascii="Garamond" w:hAnsi="Garamond"/>
-          <w:szCs w:val="22"/>
-          <w:lang w:val="es-EC"/>
-        </w:rPr>
-        <w:t xml:space="preserve"> también contiene </w:t>
-      </w:r>
-      <w:r>
-        <w:rPr>
-          <w:rFonts w:ascii="Garamond" w:hAnsi="Garamond"/>
-          <w:szCs w:val="22"/>
-          <w:lang w:val="es-EC"/>
-        </w:rPr>
-        <w:t>figuras</w:t>
-      </w:r>
-      <w:r>
-        <w:rPr>
-          <w:rFonts w:ascii="Garamond" w:hAnsi="Garamond"/>
-          <w:szCs w:val="22"/>
-          <w:lang w:val="es-EC"/>
-        </w:rPr>
-        <w:t xml:space="preserve"> que </w:t>
-      </w:r>
-      <w:r>
-        <w:rPr>
-          <w:rFonts w:ascii="Garamond" w:hAnsi="Garamond"/>
-          <w:szCs w:val="22"/>
-          <w:lang w:val="es-EC"/>
-        </w:rPr>
-        <w:t>resumen</w:t>
-      </w:r>
-      <w:r>
-        <w:rPr>
-          <w:rFonts w:ascii="Garamond" w:hAnsi="Garamond"/>
-          <w:szCs w:val="22"/>
-          <w:lang w:val="es-EC"/>
-        </w:rPr>
-        <w:t xml:space="preserve"> la composición de las MSR según la distancia a la red (ejemplo en la </w:t>
+        <w:t xml:space="preserve">La subcarpeta regional también contiene figuras que resumen la composición de las MSR según la distancia a la red (ejemplo en la </w:t>
       </w:r>
       <w:r>
         <w:rPr>
@@ -22609,22 +22004,14 @@
           <w:szCs w:val="22"/>
           <w:lang w:val="es-EC"/>
         </w:rPr>
-        <w:instrText xml:space="preserve"> REF _Ref236057620 \h </w:instrText>
-      </w:r>
-      <w:r>
-        <w:rPr>
-          <w:rFonts w:ascii="Garamond" w:hAnsi="Garamond"/>
-          <w:szCs w:val="22"/>
-          <w:lang w:val="es-EC"/>
-        </w:rPr>
-      </w:r>
-      <w:r>
-        <w:rPr>
-          <w:rFonts w:ascii="Garamond" w:hAnsi="Garamond"/>
-          <w:szCs w:val="22"/>
-          <w:lang w:val="es-EC"/>
-        </w:rPr>
-        <w:instrText xml:space="preserve"> \* MERGEFORMAT </w:instrText>
+        <w:instrText xml:space="preserve"> REF _Ref236057620 \h  \* MERGEFORMAT </w:instrText>
+      </w:r>
+      <w:r>
+        <w:rPr>
+          <w:rFonts w:ascii="Garamond" w:hAnsi="Garamond"/>
+          <w:szCs w:val="22"/>
+          <w:lang w:val="es-EC"/>
+        </w:rPr>
       </w:r>
       <w:r>
         <w:rPr>
@@ -22687,22 +22074,14 @@
           <w:szCs w:val="22"/>
           <w:lang w:val="es-EC"/>
         </w:rPr>
-        <w:instrText xml:space="preserve"> REF _Ref236057625 \h </w:instrText>
-      </w:r>
-      <w:r>
-        <w:rPr>
-          <w:rFonts w:ascii="Garamond" w:hAnsi="Garamond"/>
-          <w:szCs w:val="22"/>
-          <w:lang w:val="es-EC"/>
-        </w:rPr>
-      </w:r>
-      <w:r>
-        <w:rPr>
-          <w:rFonts w:ascii="Garamond" w:hAnsi="Garamond"/>
-          <w:szCs w:val="22"/>
-          <w:lang w:val="es-EC"/>
-        </w:rPr>
-        <w:instrText xml:space="preserve"> \* MERGEFORMAT </w:instrText>
+        <w:instrText xml:space="preserve"> REF _Ref236057625 \h  \* MERGEFORMAT </w:instrText>
+      </w:r>
+      <w:r>
+        <w:rPr>
+          <w:rFonts w:ascii="Garamond" w:hAnsi="Garamond"/>
+          <w:szCs w:val="22"/>
+          <w:lang w:val="es-EC"/>
+        </w:rPr>
       </w:r>
       <w:r>
         <w:rPr>
@@ -22749,15 +22128,7 @@
           <w:szCs w:val="22"/>
           <w:lang w:val="es-EC"/>
         </w:rPr>
-        <w:t>) y el LCOE (ejemplo en la</w:t>
-      </w:r>
-      <w:r>
-        <w:rPr>
-          <w:rFonts w:ascii="Garamond" w:hAnsi="Garamond"/>
-          <w:szCs w:val="22"/>
-          <w:lang w:val="es-EC"/>
-        </w:rPr>
-        <w:t xml:space="preserve"> </w:t>
+        <w:t xml:space="preserve">) y el LCOE (ejemplo en la </w:t>
       </w:r>
       <w:r>
         <w:rPr>
@@ -22773,22 +22144,14 @@
           <w:szCs w:val="22"/>
           <w:lang w:val="es-EC"/>
         </w:rPr>
-        <w:instrText xml:space="preserve"> REF _Ref236057631 \h </w:instrText>
-      </w:r>
-      <w:r>
-        <w:rPr>
-          <w:rFonts w:ascii="Garamond" w:hAnsi="Garamond"/>
-          <w:szCs w:val="22"/>
-          <w:lang w:val="es-EC"/>
-        </w:rPr>
-      </w:r>
-      <w:r>
-        <w:rPr>
-          <w:rFonts w:ascii="Garamond" w:hAnsi="Garamond"/>
-          <w:szCs w:val="22"/>
-          <w:lang w:val="es-EC"/>
-        </w:rPr>
-        <w:instrText xml:space="preserve"> \* MERGEFORMAT </w:instrText>
+        <w:instrText xml:space="preserve"> REF _Ref236057631 \h  \* MERGEFORMAT </w:instrText>
+      </w:r>
+      <w:r>
+        <w:rPr>
+          <w:rFonts w:ascii="Garamond" w:hAnsi="Garamond"/>
+          <w:szCs w:val="22"/>
+          <w:lang w:val="es-EC"/>
+        </w:rPr>
       </w:r>
       <w:r>
         <w:rPr>
@@ -22998,16 +22361,7 @@
           <w:szCs w:val="18"/>
           <w:lang w:val="es-EC"/>
         </w:rPr>
-        <w:t xml:space="preserve">: </w:t>
-      </w:r>
-      <w:r>
-        <w:rPr>
-          <w:rFonts w:ascii="Garamond" w:hAnsi="Garamond"/>
-          <w:sz w:val="18"/>
-          <w:szCs w:val="18"/>
-          <w:lang w:val="es-EC"/>
-        </w:rPr>
-        <w:t>Ejemplo de distribución de las MSR eólicas según la distancia a la red de transmisión (km) en Ecuador.</w:t>
+        <w:t>: Ejemplo de distribución de las MSR eólicas según la distancia a la red de transmisión (km) en Ecuador.</w:t>
       </w:r>
     </w:p>
     <w:p>
@@ -23337,25 +22691,7 @@
           <w:szCs w:val="18"/>
           <w:lang w:val="es-EC"/>
         </w:rPr>
-        <w:t xml:space="preserve">: </w:t>
-      </w:r>
-      <w:r>
-        <w:rPr>
-          <w:rFonts w:ascii="Garamond" w:hAnsi="Garamond"/>
-          <w:sz w:val="18"/>
-          <w:szCs w:val="18"/>
-          <w:lang w:val="es-EC"/>
-        </w:rPr>
-        <w:t xml:space="preserve">Ejemplo de distribución de las MSR eólicas según el </w:t>
-      </w:r>
-      <w:r>
-        <w:rPr>
-          <w:rFonts w:ascii="Garamond" w:hAnsi="Garamond"/>
-          <w:sz w:val="18"/>
-          <w:szCs w:val="18"/>
-          <w:lang w:val="es-EC"/>
-        </w:rPr>
-        <w:t>costo nivelado de electricidad (LCOE, USD/</w:t>
+        <w:t>: Ejemplo de distribución de las MSR eólicas según el costo nivelado de electricidad (LCOE, USD/</w:t>
       </w:r>
       <w:proofErr w:type="spellStart"/>
       <w:r>
@@ -23375,16 +22711,7 @@
           <w:szCs w:val="18"/>
           <w:lang w:val="es-EC"/>
         </w:rPr>
-        <w:t>)</w:t>
-      </w:r>
-      <w:r>
-        <w:rPr>
-          <w:rFonts w:ascii="Garamond" w:hAnsi="Garamond"/>
-          <w:sz w:val="18"/>
-          <w:szCs w:val="18"/>
-          <w:lang w:val="es-EC"/>
-        </w:rPr>
-        <w:t xml:space="preserve"> en Ecuador.</w:t>
+        <w:t>) en Ecuador.</w:t>
       </w:r>
     </w:p>
     <w:p>
@@ -23421,21 +22748,7 @@
           <w:rFonts w:ascii="Garamond" w:hAnsi="Garamond"/>
           <w:lang w:val="es-ES"/>
         </w:rPr>
-        <w:t>Regrese</w:t>
-      </w:r>
-      <w:r>
-        <w:rPr>
-          <w:rFonts w:ascii="Garamond" w:hAnsi="Garamond"/>
-          <w:lang w:val="es-ES"/>
-        </w:rPr>
-        <w:t xml:space="preserve"> a</w:t>
-      </w:r>
-      <w:r>
-        <w:rPr>
-          <w:rFonts w:ascii="Garamond" w:hAnsi="Garamond"/>
-          <w:lang w:val="es-ES"/>
-        </w:rPr>
-        <w:t xml:space="preserve">l </w:t>
+        <w:t xml:space="preserve">Regrese al </w:t>
       </w:r>
       <w:r>
         <w:rPr>
@@ -23469,14 +22782,7 @@
           <w:rFonts w:ascii="Garamond" w:hAnsi="Garamond"/>
           <w:lang w:val="es-ES"/>
         </w:rPr>
-        <w:t xml:space="preserve"> h</w:t>
-      </w:r>
-      <w:r>
-        <w:rPr>
-          <w:rFonts w:ascii="Garamond" w:hAnsi="Garamond"/>
-          <w:lang w:val="es-ES"/>
-        </w:rPr>
-        <w:t xml:space="preserve">oja de cálculo </w:t>
+        <w:t xml:space="preserve"> hoja de cálculo </w:t>
       </w:r>
       <w:proofErr w:type="spellStart"/>
       <w:r>
@@ -23586,14 +22892,7 @@
           <w:rFonts w:ascii="Garamond" w:hAnsi="Garamond"/>
           <w:lang w:val="es-ES"/>
         </w:rPr>
-        <w:t>.</w:t>
-      </w:r>
-      <w:r>
-        <w:rPr>
-          <w:rFonts w:ascii="Garamond" w:hAnsi="Garamond"/>
-          <w:lang w:val="es-ES"/>
-        </w:rPr>
-        <w:t xml:space="preserve"> </w:t>
+        <w:t xml:space="preserve">. </w:t>
       </w:r>
     </w:p>
     <w:p>
@@ -23746,14 +23045,7 @@
                                 <w:rFonts w:ascii="Garamond" w:hAnsi="Garamond"/>
                                 <w:lang w:val="es-ES"/>
                               </w:rPr>
-                              <w:t xml:space="preserve">para energía </w:t>
-                            </w:r>
-                            <w:r>
-                              <w:rPr>
-                                <w:rFonts w:ascii="Garamond" w:hAnsi="Garamond"/>
-                                <w:lang w:val="es-ES"/>
-                              </w:rPr>
-                              <w:t>solar fotovoltaica</w:t>
+                              <w:t>para energía solar fotovoltaica</w:t>
                             </w:r>
                             <w:r>
                               <w:rPr>
@@ -23929,65 +23221,15 @@
           <w:rFonts w:ascii="Garamond" w:hAnsi="Garamond"/>
           <w:lang w:val="es-EC"/>
         </w:rPr>
-        <w:t xml:space="preserve">Las </w:t>
-      </w:r>
-      <w:r>
-        <w:rPr>
-          <w:rFonts w:ascii="Garamond" w:hAnsi="Garamond"/>
-          <w:lang w:val="es-EC"/>
-        </w:rPr>
-        <w:t>figures resumen</w:t>
-      </w:r>
-      <w:r>
-        <w:rPr>
-          <w:rFonts w:ascii="Garamond" w:hAnsi="Garamond"/>
-          <w:lang w:val="es-EC"/>
-        </w:rPr>
-        <w:t xml:space="preserve"> la composición de </w:t>
-      </w:r>
-      <w:r>
-        <w:rPr>
-          <w:rFonts w:ascii="Garamond" w:hAnsi="Garamond"/>
-          <w:lang w:val="es-EC"/>
-        </w:rPr>
-        <w:t>MSR</w:t>
-      </w:r>
-      <w:r>
-        <w:rPr>
-          <w:rFonts w:ascii="Garamond" w:hAnsi="Garamond"/>
-          <w:lang w:val="es-EC"/>
-        </w:rPr>
-        <w:t xml:space="preserve"> para </w:t>
-      </w:r>
-      <w:r>
-        <w:rPr>
-          <w:rFonts w:ascii="Garamond" w:hAnsi="Garamond"/>
-          <w:lang w:val="es-EC"/>
-        </w:rPr>
-        <w:t>energía solar fotovoltaica</w:t>
-      </w:r>
-      <w:r>
-        <w:rPr>
-          <w:rFonts w:ascii="Garamond" w:hAnsi="Garamond"/>
-          <w:lang w:val="es-EC"/>
-        </w:rPr>
-        <w:t xml:space="preserve"> según la distancia a la red </w:t>
-      </w:r>
-      <w:r>
-        <w:rPr>
-          <w:rFonts w:ascii="Garamond" w:hAnsi="Garamond"/>
-          <w:szCs w:val="22"/>
-          <w:lang w:val="es-EC"/>
-        </w:rPr>
-        <w:t>eléctrica (ejemplo en la</w:t>
-      </w:r>
-      <w:r>
-        <w:rPr>
-          <w:rFonts w:ascii="Garamond" w:hAnsi="Garamond"/>
-          <w:szCs w:val="22"/>
-          <w:lang w:val="es-EC"/>
-        </w:rPr>
-        <w:t xml:space="preserve"> </w:t>
+        <w:t xml:space="preserve">Las figures resumen la composición de MSR para energía solar fotovoltaica según la distancia a la red </w:t>
+      </w:r>
+      <w:r>
+        <w:rPr>
+          <w:rFonts w:ascii="Garamond" w:hAnsi="Garamond"/>
+          <w:szCs w:val="22"/>
+          <w:lang w:val="es-EC"/>
+        </w:rPr>
+        <w:t xml:space="preserve">eléctrica (ejemplo en la </w:t>
       </w:r>
       <w:r>
         <w:rPr>
@@ -24127,15 +23369,7 @@
           <w:szCs w:val="22"/>
           <w:lang w:val="es-EC"/>
         </w:rPr>
-        <w:t>) y el LCOE (ejemplo en la</w:t>
-      </w:r>
-      <w:r>
-        <w:rPr>
-          <w:rFonts w:ascii="Garamond" w:hAnsi="Garamond"/>
-          <w:szCs w:val="22"/>
-          <w:lang w:val="es-EC"/>
-        </w:rPr>
-        <w:t xml:space="preserve"> </w:t>
+        <w:t xml:space="preserve">) y el LCOE (ejemplo en la </w:t>
       </w:r>
       <w:r>
         <w:rPr>
@@ -24205,23 +23439,7 @@
           <w:szCs w:val="22"/>
           <w:lang w:val="es-EC"/>
         </w:rPr>
-        <w:t xml:space="preserve">). También podemos analizar cómo se distribuye espacialmente la composición de estos atributos en todo el país utilizando </w:t>
-      </w:r>
-      <w:r>
-        <w:rPr>
-          <w:rFonts w:ascii="Garamond" w:hAnsi="Garamond"/>
-          <w:szCs w:val="22"/>
-          <w:lang w:val="es-EC"/>
-        </w:rPr>
-        <w:t xml:space="preserve">QGIS para visualizar </w:t>
-      </w:r>
-      <w:r>
-        <w:rPr>
-          <w:rFonts w:ascii="Garamond" w:hAnsi="Garamond"/>
-          <w:szCs w:val="22"/>
-          <w:lang w:val="es-EC"/>
-        </w:rPr>
-        <w:t xml:space="preserve">el archivo </w:t>
+        <w:t xml:space="preserve">). También podemos analizar cómo se distribuye espacialmente la composición de estos atributos en todo el país utilizando QGIS para visualizar el archivo </w:t>
       </w:r>
       <w:proofErr w:type="spellStart"/>
       <w:r>
@@ -24230,15 +23448,7 @@
           <w:szCs w:val="22"/>
           <w:lang w:val="es-EC"/>
         </w:rPr>
-        <w:t>s</w:t>
-      </w:r>
-      <w:r>
-        <w:rPr>
-          <w:rFonts w:ascii="Garamond" w:hAnsi="Garamond"/>
-          <w:szCs w:val="22"/>
-          <w:lang w:val="es-EC"/>
-        </w:rPr>
-        <w:t>hapefile</w:t>
+        <w:t>shapefile</w:t>
       </w:r>
       <w:proofErr w:type="spellEnd"/>
       <w:r>
@@ -24247,23 +23457,7 @@
           <w:szCs w:val="22"/>
           <w:lang w:val="es-EC"/>
         </w:rPr>
-        <w:t xml:space="preserve"> creado </w:t>
-      </w:r>
-      <w:r>
-        <w:rPr>
-          <w:rFonts w:ascii="Garamond" w:hAnsi="Garamond"/>
-          <w:szCs w:val="22"/>
-          <w:lang w:val="es-EC"/>
-        </w:rPr>
-        <w:t xml:space="preserve">por el Combinador de atributos </w:t>
-      </w:r>
-      <w:r>
-        <w:rPr>
-          <w:rFonts w:ascii="Garamond" w:hAnsi="Garamond"/>
-          <w:szCs w:val="22"/>
-          <w:lang w:val="es-EC"/>
-        </w:rPr>
-        <w:t>(</w:t>
+        <w:t xml:space="preserve"> creado por el Combinador de atributos (</w:t>
       </w:r>
       <w:r>
         <w:rPr>
@@ -24494,34 +23688,7 @@
           <w:szCs w:val="18"/>
           <w:lang w:val="es-EC"/>
         </w:rPr>
-        <w:t xml:space="preserve">: </w:t>
-      </w:r>
-      <w:r>
-        <w:rPr>
-          <w:rFonts w:ascii="Garamond" w:hAnsi="Garamond"/>
-          <w:sz w:val="18"/>
-          <w:szCs w:val="18"/>
-          <w:lang w:val="es-EC"/>
-        </w:rPr>
-        <w:t xml:space="preserve">Ejemplo de distribución de las MSR </w:t>
-      </w:r>
-      <w:r>
-        <w:rPr>
-          <w:rFonts w:ascii="Garamond" w:hAnsi="Garamond"/>
-          <w:sz w:val="18"/>
-          <w:szCs w:val="18"/>
-          <w:lang w:val="es-EC"/>
-        </w:rPr>
-        <w:t>solares fotovoltaicas</w:t>
-      </w:r>
-      <w:r>
-        <w:rPr>
-          <w:rFonts w:ascii="Garamond" w:hAnsi="Garamond"/>
-          <w:sz w:val="18"/>
-          <w:szCs w:val="18"/>
-          <w:lang w:val="es-EC"/>
-        </w:rPr>
-        <w:t xml:space="preserve"> según la distancia a la red de transmisión (km) en Ecuador.</w:t>
+        <w:t>: Ejemplo de distribución de las MSR solares fotovoltaicas según la distancia a la red de transmisión (km) en Ecuador.</w:t>
       </w:r>
     </w:p>
     <w:p>
@@ -24675,34 +23842,7 @@
           <w:szCs w:val="18"/>
           <w:lang w:val="es-EC"/>
         </w:rPr>
-        <w:t xml:space="preserve">: </w:t>
-      </w:r>
-      <w:r>
-        <w:rPr>
-          <w:rFonts w:ascii="Garamond" w:hAnsi="Garamond"/>
-          <w:sz w:val="18"/>
-          <w:szCs w:val="18"/>
-          <w:lang w:val="es-EC"/>
-        </w:rPr>
-        <w:t xml:space="preserve">Ejemplo de distribución de las MSR </w:t>
-      </w:r>
-      <w:r>
-        <w:rPr>
-          <w:rFonts w:ascii="Garamond" w:hAnsi="Garamond"/>
-          <w:sz w:val="18"/>
-          <w:szCs w:val="18"/>
-          <w:lang w:val="es-EC"/>
-        </w:rPr>
-        <w:t>solares fotovoltaicas</w:t>
-      </w:r>
-      <w:r>
-        <w:rPr>
-          <w:rFonts w:ascii="Garamond" w:hAnsi="Garamond"/>
-          <w:sz w:val="18"/>
-          <w:szCs w:val="18"/>
-          <w:lang w:val="es-EC"/>
-        </w:rPr>
-        <w:t xml:space="preserve"> según el factor de capacidad (%) en Ecuador.</w:t>
+        <w:t>: Ejemplo de distribución de las MSR solares fotovoltaicas según el factor de capacidad (%) en Ecuador.</w:t>
       </w:r>
     </w:p>
     <w:p>
@@ -24862,16 +24002,7 @@
           <w:szCs w:val="18"/>
           <w:lang w:val="es-EC"/>
         </w:rPr>
-        <w:t xml:space="preserve">: </w:t>
-      </w:r>
-      <w:r>
-        <w:rPr>
-          <w:rFonts w:ascii="Garamond" w:hAnsi="Garamond"/>
-          <w:sz w:val="18"/>
-          <w:szCs w:val="18"/>
-          <w:lang w:val="es-EC"/>
-        </w:rPr>
-        <w:t>Ejemplo de distribución de las MSR eólicas según el costo nivelado de electricidad (LCOE, USD/</w:t>
+        <w:t>: Ejemplo de distribución de las MSR eólicas según el costo nivelado de electricidad (LCOE, USD/</w:t>
       </w:r>
       <w:proofErr w:type="spellStart"/>
       <w:r>
@@ -25212,16 +24343,7 @@
           <w:szCs w:val="16"/>
           <w:lang w:val="es-EC"/>
         </w:rPr>
-        <w:t>) de las MSR solares fotovoltaicas en Ecuador.</w:t>
-      </w:r>
-      <w:r>
-        <w:rPr>
-          <w:rFonts w:ascii="Garamond" w:hAnsi="Garamond"/>
-          <w:sz w:val="18"/>
-          <w:szCs w:val="16"/>
-          <w:lang w:val="es-EC"/>
-        </w:rPr>
-        <w:t xml:space="preserve"> </w:t>
+        <w:t xml:space="preserve">) de las MSR solares fotovoltaicas en Ecuador. </w:t>
       </w:r>
     </w:p>
     <w:p>
@@ -25298,14 +24420,7 @@
           <w:rFonts w:ascii="Garamond" w:hAnsi="Garamond"/>
           <w:lang w:val="es-EC"/>
         </w:rPr>
-        <w:t>El siguiente paso consiste en crear un</w:t>
-      </w:r>
-      <w:r>
-        <w:rPr>
-          <w:rFonts w:ascii="Garamond" w:hAnsi="Garamond"/>
-          <w:lang w:val="es-EC"/>
-        </w:rPr>
-        <w:t xml:space="preserve">a </w:t>
+        <w:t xml:space="preserve">El siguiente paso consiste en crear una </w:t>
       </w:r>
       <w:proofErr w:type="spellStart"/>
       <w:r>
@@ -25321,6 +24436,20 @@
           <w:rFonts w:ascii="Garamond" w:hAnsi="Garamond"/>
           <w:lang w:val="es-EC"/>
         </w:rPr>
+        <w:t xml:space="preserve"> de MSR para inclusión en modelo</w:t>
+      </w:r>
+      <w:r>
+        <w:rPr>
+          <w:rFonts w:ascii="Garamond" w:hAnsi="Garamond"/>
+          <w:lang w:val="es-EC"/>
+        </w:rPr>
+        <w:t>s</w:t>
+      </w:r>
+      <w:r>
+        <w:rPr>
+          <w:rFonts w:ascii="Garamond" w:hAnsi="Garamond"/>
+          <w:lang w:val="es-EC"/>
+        </w:rPr>
         <w:t xml:space="preserve"> </w:t>
       </w:r>
       <w:r>
@@ -25328,14 +24457,175 @@
           <w:rFonts w:ascii="Garamond" w:hAnsi="Garamond"/>
           <w:lang w:val="es-EC"/>
         </w:rPr>
-        <w:t>de MSR para inclusión en modelo</w:t>
-      </w:r>
-      <w:r>
-        <w:rPr>
-          <w:rFonts w:ascii="Garamond" w:hAnsi="Garamond"/>
-          <w:lang w:val="es-EC"/>
-        </w:rPr>
-        <w:t>s</w:t>
+        <w:t>energéticos</w:t>
+      </w:r>
+      <w:r>
+        <w:rPr>
+          <w:rFonts w:ascii="Garamond" w:hAnsi="Garamond"/>
+          <w:lang w:val="es-EC"/>
+        </w:rPr>
+        <w:t>. El enfoque estándar consiste en clasificar l</w:t>
+      </w:r>
+      <w:r>
+        <w:rPr>
+          <w:rFonts w:ascii="Garamond" w:hAnsi="Garamond"/>
+          <w:lang w:val="es-EC"/>
+        </w:rPr>
+        <w:t>a</w:t>
+      </w:r>
+      <w:r>
+        <w:rPr>
+          <w:rFonts w:ascii="Garamond" w:hAnsi="Garamond"/>
+          <w:lang w:val="es-EC"/>
+        </w:rPr>
+        <w:t xml:space="preserve">s MSR según el LCOE esperado (incluidos </w:t>
+      </w:r>
+      <w:r>
+        <w:rPr>
+          <w:rFonts w:ascii="Garamond" w:hAnsi="Garamond"/>
+          <w:lang w:val="es-EC"/>
+        </w:rPr>
+        <w:t>los costos</w:t>
+      </w:r>
+      <w:r>
+        <w:rPr>
+          <w:rFonts w:ascii="Garamond" w:hAnsi="Garamond"/>
+          <w:lang w:val="es-EC"/>
+        </w:rPr>
+        <w:t xml:space="preserve"> de </w:t>
+      </w:r>
+      <w:r>
+        <w:rPr>
+          <w:rFonts w:ascii="Garamond" w:hAnsi="Garamond"/>
+          <w:lang w:val="es-EC"/>
+        </w:rPr>
+        <w:t>construcción de la central</w:t>
+      </w:r>
+      <w:r>
+        <w:rPr>
+          <w:rFonts w:ascii="Garamond" w:hAnsi="Garamond"/>
+          <w:lang w:val="es-EC"/>
+        </w:rPr>
+        <w:t xml:space="preserve">, la </w:t>
+      </w:r>
+      <w:r>
+        <w:rPr>
+          <w:rFonts w:ascii="Garamond" w:hAnsi="Garamond"/>
+          <w:lang w:val="es-EC"/>
+        </w:rPr>
+        <w:t>expansión</w:t>
+      </w:r>
+      <w:r>
+        <w:rPr>
+          <w:rFonts w:ascii="Garamond" w:hAnsi="Garamond"/>
+          <w:lang w:val="es-EC"/>
+        </w:rPr>
+        <w:t xml:space="preserve"> de la red de transmisión</w:t>
+      </w:r>
+      <w:r>
+        <w:rPr>
+          <w:rFonts w:ascii="Garamond" w:hAnsi="Garamond"/>
+          <w:lang w:val="es-EC"/>
+        </w:rPr>
+        <w:t>,</w:t>
+      </w:r>
+      <w:r>
+        <w:rPr>
+          <w:rFonts w:ascii="Garamond" w:hAnsi="Garamond"/>
+          <w:lang w:val="es-EC"/>
+        </w:rPr>
+        <w:t xml:space="preserve"> y la </w:t>
+      </w:r>
+      <w:r>
+        <w:rPr>
+          <w:rFonts w:ascii="Garamond" w:hAnsi="Garamond"/>
+          <w:lang w:val="es-EC"/>
+        </w:rPr>
+        <w:t>expansión</w:t>
+      </w:r>
+      <w:r>
+        <w:rPr>
+          <w:rFonts w:ascii="Garamond" w:hAnsi="Garamond"/>
+          <w:lang w:val="es-EC"/>
+        </w:rPr>
+        <w:t xml:space="preserve"> de la red vial), y crear</w:t>
+      </w:r>
+      <w:r>
+        <w:rPr>
+          <w:rFonts w:ascii="Garamond" w:hAnsi="Garamond"/>
+          <w:lang w:val="es-EC"/>
+        </w:rPr>
+        <w:t xml:space="preserve"> así</w:t>
+      </w:r>
+      <w:r>
+        <w:rPr>
+          <w:rFonts w:ascii="Garamond" w:hAnsi="Garamond"/>
+          <w:lang w:val="es-EC"/>
+        </w:rPr>
+        <w:t xml:space="preserve"> un</w:t>
+      </w:r>
+      <w:r>
+        <w:rPr>
+          <w:rFonts w:ascii="Garamond" w:hAnsi="Garamond"/>
+          <w:lang w:val="es-EC"/>
+        </w:rPr>
+        <w:t xml:space="preserve"> subconjunto </w:t>
+      </w:r>
+      <w:r>
+        <w:rPr>
+          <w:rFonts w:ascii="Garamond" w:hAnsi="Garamond"/>
+          <w:lang w:val="es-EC"/>
+        </w:rPr>
+        <w:t>de aquell</w:t>
+      </w:r>
+      <w:r>
+        <w:rPr>
+          <w:rFonts w:ascii="Garamond" w:hAnsi="Garamond"/>
+          <w:lang w:val="es-EC"/>
+        </w:rPr>
+        <w:t>a</w:t>
+      </w:r>
+      <w:r>
+        <w:rPr>
+          <w:rFonts w:ascii="Garamond" w:hAnsi="Garamond"/>
+          <w:lang w:val="es-EC"/>
+        </w:rPr>
+        <w:t xml:space="preserve">s </w:t>
+      </w:r>
+      <w:r>
+        <w:rPr>
+          <w:rFonts w:ascii="Garamond" w:hAnsi="Garamond"/>
+          <w:lang w:val="es-EC"/>
+        </w:rPr>
+        <w:t xml:space="preserve">MSR </w:t>
+      </w:r>
+      <w:r>
+        <w:rPr>
+          <w:rFonts w:ascii="Garamond" w:hAnsi="Garamond"/>
+          <w:lang w:val="es-EC"/>
+        </w:rPr>
+        <w:t>en l</w:t>
+      </w:r>
+      <w:r>
+        <w:rPr>
+          <w:rFonts w:ascii="Garamond" w:hAnsi="Garamond"/>
+          <w:lang w:val="es-EC"/>
+        </w:rPr>
+        <w:t>a</w:t>
+      </w:r>
+      <w:r>
+        <w:rPr>
+          <w:rFonts w:ascii="Garamond" w:hAnsi="Garamond"/>
+          <w:lang w:val="es-EC"/>
+        </w:rPr>
+        <w:t xml:space="preserve">s que la </w:t>
+      </w:r>
+      <w:r>
+        <w:rPr>
+          <w:rFonts w:ascii="Garamond" w:hAnsi="Garamond"/>
+          <w:lang w:val="es-EC"/>
+        </w:rPr>
+        <w:t>producción</w:t>
       </w:r>
       <w:r>
         <w:rPr>
@@ -25349,14 +24639,74 @@
           <w:rFonts w:ascii="Garamond" w:hAnsi="Garamond"/>
           <w:lang w:val="es-EC"/>
         </w:rPr>
-        <w:t>energéticos</w:t>
-      </w:r>
-      <w:r>
-        <w:rPr>
-          <w:rFonts w:ascii="Garamond" w:hAnsi="Garamond"/>
-          <w:lang w:val="es-EC"/>
-        </w:rPr>
-        <w:t>. El enfoque estándar consiste en clasificar l</w:t>
+        <w:t>energética</w:t>
+      </w:r>
+      <w:r>
+        <w:rPr>
+          <w:rFonts w:ascii="Garamond" w:hAnsi="Garamond"/>
+          <w:lang w:val="es-EC"/>
+        </w:rPr>
+        <w:t xml:space="preserve"> </w:t>
+      </w:r>
+      <w:r>
+        <w:rPr>
+          <w:rFonts w:ascii="Garamond" w:hAnsi="Garamond"/>
+          <w:lang w:val="es-EC"/>
+        </w:rPr>
+        <w:t xml:space="preserve">sería más </w:t>
+      </w:r>
+      <w:r>
+        <w:rPr>
+          <w:rFonts w:ascii="Garamond" w:hAnsi="Garamond"/>
+          <w:lang w:val="es-EC"/>
+        </w:rPr>
+        <w:t>barata</w:t>
+      </w:r>
+      <w:r>
+        <w:rPr>
+          <w:rFonts w:ascii="Garamond" w:hAnsi="Garamond"/>
+          <w:lang w:val="es-EC"/>
+        </w:rPr>
+        <w:t xml:space="preserve"> según este LCOE.</w:t>
+      </w:r>
+    </w:p>
+    <w:p>
+      <w:pPr>
+        <w:rPr>
+          <w:rFonts w:ascii="Garamond" w:hAnsi="Garamond"/>
+          <w:lang w:val="es-EC"/>
+        </w:rPr>
+      </w:pPr>
+    </w:p>
+    <w:p>
+      <w:pPr>
+        <w:rPr>
+          <w:rFonts w:ascii="Garamond" w:hAnsi="Garamond"/>
+          <w:lang w:val="es-EC"/>
+        </w:rPr>
+      </w:pPr>
+      <w:r>
+        <w:rPr>
+          <w:rFonts w:ascii="Garamond" w:hAnsi="Garamond"/>
+          <w:lang w:val="es-EC"/>
+        </w:rPr>
+        <w:t xml:space="preserve">Esta </w:t>
+      </w:r>
+      <w:proofErr w:type="spellStart"/>
+      <w:r>
+        <w:rPr>
+          <w:rFonts w:ascii="Garamond" w:hAnsi="Garamond"/>
+          <w:lang w:val="es-EC"/>
+        </w:rPr>
+        <w:t>subselección</w:t>
+      </w:r>
+      <w:proofErr w:type="spellEnd"/>
+      <w:r>
+        <w:rPr>
+          <w:rFonts w:ascii="Garamond" w:hAnsi="Garamond"/>
+          <w:lang w:val="es-EC"/>
+        </w:rPr>
+        <w:t xml:space="preserve"> se crea mediante un parámetro de área definido por el usuario que permite seleccionar l</w:t>
       </w:r>
       <w:r>
         <w:rPr>
@@ -25370,154 +24720,59 @@
           <w:rFonts w:ascii="Garamond" w:hAnsi="Garamond"/>
           <w:lang w:val="es-EC"/>
         </w:rPr>
-        <w:t xml:space="preserve">s MSR según el LCOE esperado (incluidos </w:t>
-      </w:r>
-      <w:r>
-        <w:rPr>
-          <w:rFonts w:ascii="Garamond" w:hAnsi="Garamond"/>
-          <w:lang w:val="es-EC"/>
-        </w:rPr>
-        <w:t>los costos</w:t>
-      </w:r>
-      <w:r>
-        <w:rPr>
-          <w:rFonts w:ascii="Garamond" w:hAnsi="Garamond"/>
-          <w:lang w:val="es-EC"/>
-        </w:rPr>
-        <w:t xml:space="preserve"> de </w:t>
-      </w:r>
-      <w:r>
-        <w:rPr>
-          <w:rFonts w:ascii="Garamond" w:hAnsi="Garamond"/>
-          <w:lang w:val="es-EC"/>
-        </w:rPr>
-        <w:t>construcción de la central</w:t>
-      </w:r>
-      <w:r>
-        <w:rPr>
-          <w:rFonts w:ascii="Garamond" w:hAnsi="Garamond"/>
-          <w:lang w:val="es-EC"/>
-        </w:rPr>
-        <w:t xml:space="preserve">, la </w:t>
-      </w:r>
-      <w:r>
-        <w:rPr>
-          <w:rFonts w:ascii="Garamond" w:hAnsi="Garamond"/>
-          <w:lang w:val="es-EC"/>
-        </w:rPr>
-        <w:t>expansión</w:t>
-      </w:r>
-      <w:r>
-        <w:rPr>
-          <w:rFonts w:ascii="Garamond" w:hAnsi="Garamond"/>
-          <w:lang w:val="es-EC"/>
-        </w:rPr>
-        <w:t xml:space="preserve"> de la red de transmisión</w:t>
-      </w:r>
-      <w:r>
-        <w:rPr>
-          <w:rFonts w:ascii="Garamond" w:hAnsi="Garamond"/>
-          <w:lang w:val="es-EC"/>
-        </w:rPr>
-        <w:t>,</w:t>
-      </w:r>
-      <w:r>
-        <w:rPr>
-          <w:rFonts w:ascii="Garamond" w:hAnsi="Garamond"/>
-          <w:lang w:val="es-EC"/>
-        </w:rPr>
-        <w:t xml:space="preserve"> y la </w:t>
-      </w:r>
-      <w:r>
-        <w:rPr>
-          <w:rFonts w:ascii="Garamond" w:hAnsi="Garamond"/>
-          <w:lang w:val="es-EC"/>
-        </w:rPr>
-        <w:t>expansión</w:t>
-      </w:r>
-      <w:r>
-        <w:rPr>
-          <w:rFonts w:ascii="Garamond" w:hAnsi="Garamond"/>
-          <w:lang w:val="es-EC"/>
-        </w:rPr>
-        <w:t xml:space="preserve"> de la red vial), y crear</w:t>
-      </w:r>
-      <w:r>
-        <w:rPr>
-          <w:rFonts w:ascii="Garamond" w:hAnsi="Garamond"/>
-          <w:lang w:val="es-EC"/>
-        </w:rPr>
-        <w:t xml:space="preserve"> así</w:t>
-      </w:r>
-      <w:r>
-        <w:rPr>
-          <w:rFonts w:ascii="Garamond" w:hAnsi="Garamond"/>
-          <w:lang w:val="es-EC"/>
-        </w:rPr>
-        <w:t xml:space="preserve"> un</w:t>
-      </w:r>
-      <w:r>
-        <w:rPr>
-          <w:rFonts w:ascii="Garamond" w:hAnsi="Garamond"/>
-          <w:lang w:val="es-EC"/>
-        </w:rPr>
-        <w:t xml:space="preserve"> subconjunto </w:t>
-      </w:r>
-      <w:r>
-        <w:rPr>
-          <w:rFonts w:ascii="Garamond" w:hAnsi="Garamond"/>
-          <w:lang w:val="es-EC"/>
-        </w:rPr>
-        <w:t>de aquell</w:t>
-      </w:r>
-      <w:r>
-        <w:rPr>
-          <w:rFonts w:ascii="Garamond" w:hAnsi="Garamond"/>
-          <w:lang w:val="es-EC"/>
-        </w:rPr>
-        <w:t>a</w:t>
-      </w:r>
-      <w:r>
-        <w:rPr>
-          <w:rFonts w:ascii="Garamond" w:hAnsi="Garamond"/>
-          <w:lang w:val="es-EC"/>
-        </w:rPr>
-        <w:t xml:space="preserve">s </w:t>
-      </w:r>
-      <w:r>
-        <w:rPr>
-          <w:rFonts w:ascii="Garamond" w:hAnsi="Garamond"/>
-          <w:lang w:val="es-EC"/>
-        </w:rPr>
-        <w:t xml:space="preserve">MSR </w:t>
-      </w:r>
-      <w:r>
-        <w:rPr>
-          <w:rFonts w:ascii="Garamond" w:hAnsi="Garamond"/>
-          <w:lang w:val="es-EC"/>
-        </w:rPr>
-        <w:t>en l</w:t>
-      </w:r>
-      <w:r>
-        <w:rPr>
-          <w:rFonts w:ascii="Garamond" w:hAnsi="Garamond"/>
-          <w:lang w:val="es-EC"/>
-        </w:rPr>
-        <w:t>a</w:t>
-      </w:r>
-      <w:r>
-        <w:rPr>
-          <w:rFonts w:ascii="Garamond" w:hAnsi="Garamond"/>
-          <w:lang w:val="es-EC"/>
-        </w:rPr>
-        <w:t xml:space="preserve">s que la </w:t>
-      </w:r>
-      <w:r>
-        <w:rPr>
-          <w:rFonts w:ascii="Garamond" w:hAnsi="Garamond"/>
-          <w:lang w:val="es-EC"/>
-        </w:rPr>
-        <w:t>producción</w:t>
+        <w:t xml:space="preserve">s mejores MSR hasta alcanzar un porcentaje determinado </w:t>
+      </w:r>
+      <w:r>
+        <w:rPr>
+          <w:rFonts w:ascii="Garamond" w:hAnsi="Garamond"/>
+          <w:lang w:val="es-EC"/>
+        </w:rPr>
+        <w:t>(</w:t>
+      </w:r>
+      <w:r>
+        <w:rPr>
+          <w:rFonts w:ascii="Garamond" w:hAnsi="Garamond"/>
+          <w:lang w:val="es-EC"/>
+        </w:rPr>
+        <w:t>límite</w:t>
+      </w:r>
+      <w:r>
+        <w:rPr>
+          <w:rFonts w:ascii="Garamond" w:hAnsi="Garamond"/>
+          <w:lang w:val="es-EC"/>
+        </w:rPr>
+        <w:t xml:space="preserve"> superior) </w:t>
+      </w:r>
+      <w:r>
+        <w:rPr>
+          <w:rFonts w:ascii="Garamond" w:hAnsi="Garamond"/>
+          <w:lang w:val="es-EC"/>
+        </w:rPr>
+        <w:t>de la superficie de un país.</w:t>
+      </w:r>
+    </w:p>
+    <w:p>
+      <w:pPr>
+        <w:pStyle w:val="Heading3"/>
+        <w:rPr>
+          <w:rFonts w:ascii="Garamond" w:hAnsi="Garamond"/>
+          <w:lang w:val="es-EC"/>
+        </w:rPr>
+      </w:pPr>
+      <w:bookmarkStart w:id="51" w:name="_Toc236062451"/>
+      <w:r>
+        <w:rPr>
+          <w:rFonts w:ascii="Garamond" w:hAnsi="Garamond"/>
+          <w:lang w:val="es-EC"/>
+        </w:rPr>
+        <w:t>Part</w:t>
+      </w:r>
+      <w:r>
+        <w:rPr>
+          <w:rFonts w:ascii="Garamond" w:hAnsi="Garamond"/>
+          <w:lang w:val="es-EC"/>
+        </w:rPr>
+        <w:t>e</w:t>
       </w:r>
       <w:r>
         <w:rPr>
@@ -25531,167 +24786,6 @@
           <w:rFonts w:ascii="Garamond" w:hAnsi="Garamond"/>
           <w:lang w:val="es-EC"/>
         </w:rPr>
-        <w:t>energética</w:t>
-      </w:r>
-      <w:r>
-        <w:rPr>
-          <w:rFonts w:ascii="Garamond" w:hAnsi="Garamond"/>
-          <w:lang w:val="es-EC"/>
-        </w:rPr>
-        <w:t xml:space="preserve"> </w:t>
-      </w:r>
-      <w:r>
-        <w:rPr>
-          <w:rFonts w:ascii="Garamond" w:hAnsi="Garamond"/>
-          <w:lang w:val="es-EC"/>
-        </w:rPr>
-        <w:t xml:space="preserve">sería más </w:t>
-      </w:r>
-      <w:r>
-        <w:rPr>
-          <w:rFonts w:ascii="Garamond" w:hAnsi="Garamond"/>
-          <w:lang w:val="es-EC"/>
-        </w:rPr>
-        <w:t>barata</w:t>
-      </w:r>
-      <w:r>
-        <w:rPr>
-          <w:rFonts w:ascii="Garamond" w:hAnsi="Garamond"/>
-          <w:lang w:val="es-EC"/>
-        </w:rPr>
-        <w:t xml:space="preserve"> según este LCOE.</w:t>
-      </w:r>
-    </w:p>
-    <w:p>
-      <w:pPr>
-        <w:rPr>
-          <w:rFonts w:ascii="Garamond" w:hAnsi="Garamond"/>
-          <w:lang w:val="es-EC"/>
-        </w:rPr>
-      </w:pPr>
-    </w:p>
-    <w:p>
-      <w:pPr>
-        <w:rPr>
-          <w:rFonts w:ascii="Garamond" w:hAnsi="Garamond"/>
-          <w:lang w:val="es-EC"/>
-        </w:rPr>
-      </w:pPr>
-      <w:r>
-        <w:rPr>
-          <w:rFonts w:ascii="Garamond" w:hAnsi="Garamond"/>
-          <w:lang w:val="es-EC"/>
-        </w:rPr>
-        <w:t xml:space="preserve">Esta </w:t>
-      </w:r>
-      <w:proofErr w:type="spellStart"/>
-      <w:r>
-        <w:rPr>
-          <w:rFonts w:ascii="Garamond" w:hAnsi="Garamond"/>
-          <w:lang w:val="es-EC"/>
-        </w:rPr>
-        <w:t>subselección</w:t>
-      </w:r>
-      <w:proofErr w:type="spellEnd"/>
-      <w:r>
-        <w:rPr>
-          <w:rFonts w:ascii="Garamond" w:hAnsi="Garamond"/>
-          <w:lang w:val="es-EC"/>
-        </w:rPr>
-        <w:t xml:space="preserve"> se </w:t>
-      </w:r>
-      <w:r>
-        <w:rPr>
-          <w:rFonts w:ascii="Garamond" w:hAnsi="Garamond"/>
-          <w:lang w:val="es-EC"/>
-        </w:rPr>
-        <w:t>crea</w:t>
-      </w:r>
-      <w:r>
-        <w:rPr>
-          <w:rFonts w:ascii="Garamond" w:hAnsi="Garamond"/>
-          <w:lang w:val="es-EC"/>
-        </w:rPr>
-        <w:t xml:space="preserve"> mediante un parámetro de área definido por el usuario que permite seleccionar l</w:t>
-      </w:r>
-      <w:r>
-        <w:rPr>
-          <w:rFonts w:ascii="Garamond" w:hAnsi="Garamond"/>
-          <w:lang w:val="es-EC"/>
-        </w:rPr>
-        <w:t>a</w:t>
-      </w:r>
-      <w:r>
-        <w:rPr>
-          <w:rFonts w:ascii="Garamond" w:hAnsi="Garamond"/>
-          <w:lang w:val="es-EC"/>
-        </w:rPr>
-        <w:t xml:space="preserve">s mejores MSR hasta alcanzar un porcentaje determinado </w:t>
-      </w:r>
-      <w:r>
-        <w:rPr>
-          <w:rFonts w:ascii="Garamond" w:hAnsi="Garamond"/>
-          <w:lang w:val="es-EC"/>
-        </w:rPr>
-        <w:t>(</w:t>
-      </w:r>
-      <w:r>
-        <w:rPr>
-          <w:rFonts w:ascii="Garamond" w:hAnsi="Garamond"/>
-          <w:lang w:val="es-EC"/>
-        </w:rPr>
-        <w:t>límite</w:t>
-      </w:r>
-      <w:r>
-        <w:rPr>
-          <w:rFonts w:ascii="Garamond" w:hAnsi="Garamond"/>
-          <w:lang w:val="es-EC"/>
-        </w:rPr>
-        <w:t xml:space="preserve"> superior) </w:t>
-      </w:r>
-      <w:r>
-        <w:rPr>
-          <w:rFonts w:ascii="Garamond" w:hAnsi="Garamond"/>
-          <w:lang w:val="es-EC"/>
-        </w:rPr>
-        <w:t>de la superficie de un país.</w:t>
-      </w:r>
-    </w:p>
-    <w:p>
-      <w:pPr>
-        <w:pStyle w:val="Heading3"/>
-        <w:rPr>
-          <w:rFonts w:ascii="Garamond" w:hAnsi="Garamond"/>
-          <w:lang w:val="es-EC"/>
-        </w:rPr>
-      </w:pPr>
-      <w:bookmarkStart w:id="51" w:name="_Toc236062451"/>
-      <w:r>
-        <w:rPr>
-          <w:rFonts w:ascii="Garamond" w:hAnsi="Garamond"/>
-          <w:lang w:val="es-EC"/>
-        </w:rPr>
-        <w:t>Part</w:t>
-      </w:r>
-      <w:r>
-        <w:rPr>
-          <w:rFonts w:ascii="Garamond" w:hAnsi="Garamond"/>
-          <w:lang w:val="es-EC"/>
-        </w:rPr>
-        <w:t>e</w:t>
-      </w:r>
-      <w:r>
-        <w:rPr>
-          <w:rFonts w:ascii="Garamond" w:hAnsi="Garamond"/>
-          <w:lang w:val="es-EC"/>
-        </w:rPr>
-        <w:t xml:space="preserve"> </w:t>
-      </w:r>
-      <w:r>
-        <w:rPr>
-          <w:rFonts w:ascii="Garamond" w:hAnsi="Garamond"/>
-          <w:lang w:val="es-EC"/>
-        </w:rPr>
         <w:t>4</w:t>
       </w:r>
       <w:r>
@@ -25730,14 +24824,7 @@
           <w:rFonts w:ascii="Garamond" w:hAnsi="Garamond"/>
           <w:lang w:val="es-EC"/>
         </w:rPr>
-        <w:t>Abra el</w:t>
-      </w:r>
-      <w:r>
-        <w:rPr>
-          <w:rFonts w:ascii="Garamond" w:hAnsi="Garamond"/>
-          <w:lang w:val="es-EC"/>
-        </w:rPr>
-        <w:t xml:space="preserve"> </w:t>
+        <w:t xml:space="preserve">Abra el </w:t>
       </w:r>
       <w:r>
         <w:rPr>
@@ -25753,21 +24840,7 @@
           <w:rFonts w:ascii="Garamond" w:hAnsi="Garamond"/>
           <w:lang w:val="es-EC"/>
         </w:rPr>
-        <w:t xml:space="preserve"> del </w:t>
-      </w:r>
-      <w:r>
-        <w:rPr>
-          <w:rFonts w:ascii="Garamond" w:hAnsi="Garamond"/>
-          <w:lang w:val="es-EC"/>
-        </w:rPr>
-        <w:t>Seleccionador</w:t>
-      </w:r>
-      <w:r>
-        <w:rPr>
-          <w:rFonts w:ascii="Garamond" w:hAnsi="Garamond"/>
-          <w:lang w:val="es-EC"/>
-        </w:rPr>
-        <w:t xml:space="preserve">, </w:t>
+        <w:t xml:space="preserve"> del Seleccionador, </w:t>
       </w:r>
       <w:r>
         <w:rPr>
@@ -25786,14 +24859,7 @@
           <w:rFonts w:ascii="Garamond" w:hAnsi="Garamond"/>
           <w:lang w:val="es-EC"/>
         </w:rPr>
-        <w:t>, que tiene la misma estructura de hojas de cálculo que los demás archivos de control.</w:t>
-      </w:r>
-      <w:r>
-        <w:rPr>
-          <w:rFonts w:ascii="Garamond" w:hAnsi="Garamond"/>
-          <w:lang w:val="es-EC"/>
-        </w:rPr>
-        <w:t xml:space="preserve"> </w:t>
+        <w:t xml:space="preserve">, que tiene la misma estructura de hojas de cálculo que los demás archivos de control. </w:t>
       </w:r>
     </w:p>
     <w:p>
@@ -26019,22 +25085,14 @@
           <w:szCs w:val="22"/>
           <w:lang w:val="es-EC"/>
         </w:rPr>
-        <w:instrText xml:space="preserve"> REF _Ref235972775 \h </w:instrText>
-      </w:r>
-      <w:r>
-        <w:rPr>
-          <w:rFonts w:ascii="Garamond" w:hAnsi="Garamond"/>
-          <w:szCs w:val="22"/>
-          <w:lang w:val="es-EC"/>
-        </w:rPr>
-      </w:r>
-      <w:r>
-        <w:rPr>
-          <w:rFonts w:ascii="Garamond" w:hAnsi="Garamond"/>
-          <w:szCs w:val="22"/>
-          <w:lang w:val="es-EC"/>
-        </w:rPr>
-        <w:instrText xml:space="preserve"> \* MERGEFORMAT </w:instrText>
+        <w:instrText xml:space="preserve"> REF _Ref235972775 \h  \* MERGEFORMAT </w:instrText>
+      </w:r>
+      <w:r>
+        <w:rPr>
+          <w:rFonts w:ascii="Garamond" w:hAnsi="Garamond"/>
+          <w:szCs w:val="22"/>
+          <w:lang w:val="es-EC"/>
+        </w:rPr>
       </w:r>
       <w:r>
         <w:rPr>
@@ -26154,23 +25212,7 @@
           <w:szCs w:val="22"/>
           <w:lang w:val="es-EC"/>
         </w:rPr>
-        <w:t>Ingres</w:t>
-      </w:r>
-      <w:r>
-        <w:rPr>
-          <w:rFonts w:ascii="Garamond" w:hAnsi="Garamond"/>
-          <w:szCs w:val="22"/>
-          <w:lang w:val="es-EC"/>
-        </w:rPr>
-        <w:t>e</w:t>
-      </w:r>
-      <w:r>
-        <w:rPr>
-          <w:rFonts w:ascii="Garamond" w:hAnsi="Garamond"/>
-          <w:szCs w:val="22"/>
-          <w:lang w:val="es-EC"/>
-        </w:rPr>
-        <w:t xml:space="preserve"> los nombres de los conjuntos de datos que se van a importar, como en la </w:t>
+        <w:t xml:space="preserve">Ingrese los nombres de los conjuntos de datos que se van a importar, como en la </w:t>
       </w:r>
       <w:r>
         <w:rPr>
@@ -26194,14 +25236,14 @@
           <w:szCs w:val="22"/>
           <w:lang w:val="es-EC"/>
         </w:rPr>
-      </w:r>
-      <w:r>
-        <w:rPr>
-          <w:rFonts w:ascii="Garamond" w:hAnsi="Garamond"/>
-          <w:szCs w:val="22"/>
-          <w:lang w:val="es-EC"/>
-        </w:rPr>
         <w:instrText xml:space="preserve"> \* MERGEFORMAT </w:instrText>
+      </w:r>
+      <w:r>
+        <w:rPr>
+          <w:rFonts w:ascii="Garamond" w:hAnsi="Garamond"/>
+          <w:szCs w:val="22"/>
+          <w:lang w:val="es-EC"/>
+        </w:rPr>
       </w:r>
       <w:r>
         <w:rPr>
@@ -26367,21 +25409,7 @@
           <w:rFonts w:ascii="Garamond" w:hAnsi="Garamond"/>
           <w:lang w:val="es-EC"/>
         </w:rPr>
-        <w:t>Ech</w:t>
-      </w:r>
-      <w:r>
-        <w:rPr>
-          <w:rFonts w:ascii="Garamond" w:hAnsi="Garamond"/>
-          <w:lang w:val="es-EC"/>
-        </w:rPr>
-        <w:t xml:space="preserve">e </w:t>
-      </w:r>
-      <w:r>
-        <w:rPr>
-          <w:rFonts w:ascii="Garamond" w:hAnsi="Garamond"/>
-          <w:lang w:val="es-EC"/>
-        </w:rPr>
-        <w:t xml:space="preserve">un vistazo también a esos archivos y </w:t>
+        <w:t xml:space="preserve">Eche un vistazo también a esos archivos y </w:t>
       </w:r>
       <w:r>
         <w:rPr>
@@ -26390,84 +25418,14 @@
           <w:bCs/>
           <w:lang w:val="es-EC"/>
         </w:rPr>
-        <w:t>aseg</w:t>
-      </w:r>
-      <w:r>
-        <w:rPr>
-          <w:rFonts w:ascii="Garamond" w:hAnsi="Garamond"/>
-          <w:b/>
-          <w:bCs/>
-          <w:lang w:val="es-EC"/>
-        </w:rPr>
-        <w:t>úres</w:t>
-      </w:r>
-      <w:r>
-        <w:rPr>
-          <w:rFonts w:ascii="Garamond" w:hAnsi="Garamond"/>
-          <w:b/>
-          <w:bCs/>
-          <w:lang w:val="es-EC"/>
-        </w:rPr>
-        <w:t>e de que se haya asignado a Ecuador</w:t>
-      </w:r>
-      <w:r>
-        <w:rPr>
-          <w:rFonts w:ascii="Garamond" w:hAnsi="Garamond"/>
-          <w:b/>
-          <w:bCs/>
-          <w:lang w:val="es-EC"/>
-        </w:rPr>
-        <w:t xml:space="preserve"> </w:t>
-      </w:r>
-      <w:r>
-        <w:rPr>
-          <w:rFonts w:ascii="Garamond" w:hAnsi="Garamond"/>
-          <w:b/>
-          <w:bCs/>
-          <w:lang w:val="es-EC"/>
-        </w:rPr>
-        <w:t>un límite</w:t>
-      </w:r>
-      <w:r>
-        <w:rPr>
-          <w:rFonts w:ascii="Garamond" w:hAnsi="Garamond"/>
-          <w:b/>
-          <w:bCs/>
-          <w:lang w:val="es-EC"/>
-        </w:rPr>
-        <w:t xml:space="preserve"> superior</w:t>
-      </w:r>
-      <w:r>
-        <w:rPr>
-          <w:rFonts w:ascii="Garamond" w:hAnsi="Garamond"/>
-          <w:b/>
-          <w:bCs/>
-          <w:lang w:val="es-EC"/>
-        </w:rPr>
-        <w:t xml:space="preserve"> del 5 % </w:t>
-      </w:r>
-      <w:r>
-        <w:rPr>
-          <w:rFonts w:ascii="Garamond" w:hAnsi="Garamond"/>
-          <w:b/>
-          <w:bCs/>
-          <w:lang w:val="es-EC"/>
-        </w:rPr>
-        <w:t>de su superficie</w:t>
-      </w:r>
-      <w:r>
-        <w:rPr>
-          <w:rFonts w:ascii="Garamond" w:hAnsi="Garamond"/>
-          <w:lang w:val="es-EC"/>
-        </w:rPr>
-        <w:t>.</w:t>
-      </w:r>
-      <w:r>
-        <w:rPr>
-          <w:rFonts w:ascii="Garamond" w:hAnsi="Garamond"/>
-          <w:lang w:val="es-EC"/>
-        </w:rPr>
-        <w:t xml:space="preserve"> </w:t>
+        <w:t>asegúrese de que se haya asignado a Ecuador un límite superior del 5 % de su superficie</w:t>
+      </w:r>
+      <w:r>
+        <w:rPr>
+          <w:rFonts w:ascii="Garamond" w:hAnsi="Garamond"/>
+          <w:lang w:val="es-EC"/>
+        </w:rPr>
+        <w:t xml:space="preserve">. </w:t>
       </w:r>
     </w:p>
     <w:p>
@@ -26633,16 +25591,7 @@
           <w:szCs w:val="18"/>
           <w:lang w:val="es-EC"/>
         </w:rPr>
-        <w:t xml:space="preserve">: </w:t>
-      </w:r>
-      <w:r>
-        <w:rPr>
-          <w:rFonts w:ascii="Garamond" w:hAnsi="Garamond"/>
-          <w:sz w:val="18"/>
-          <w:szCs w:val="18"/>
-          <w:lang w:val="es-EC"/>
-        </w:rPr>
-        <w:t xml:space="preserve">Vincular los conjuntos de datos de entrada correctos en el </w:t>
+        <w:t xml:space="preserve">: Vincular los conjuntos de datos de entrada correctos en el </w:t>
       </w:r>
       <w:r>
         <w:rPr>
@@ -26795,21 +25744,7 @@
           <w:rFonts w:ascii="Garamond" w:hAnsi="Garamond"/>
           <w:lang w:val="es-EC"/>
         </w:rPr>
-        <w:t>Estable</w:t>
-      </w:r>
-      <w:r>
-        <w:rPr>
-          <w:rFonts w:ascii="Garamond" w:hAnsi="Garamond"/>
-          <w:lang w:val="es-EC"/>
-        </w:rPr>
-        <w:t>zca</w:t>
-      </w:r>
-      <w:r>
-        <w:rPr>
-          <w:rFonts w:ascii="Garamond" w:hAnsi="Garamond"/>
-          <w:lang w:val="es-EC"/>
-        </w:rPr>
-        <w:t xml:space="preserve"> </w:t>
+        <w:t xml:space="preserve">Establezca </w:t>
       </w:r>
       <w:proofErr w:type="spellStart"/>
       <w:r>
@@ -26918,22 +25853,14 @@
           <w:szCs w:val="22"/>
           <w:lang w:val="es-EC"/>
         </w:rPr>
-        <w:instrText xml:space="preserve"> REF _Ref236061504 \h </w:instrText>
-      </w:r>
-      <w:r>
-        <w:rPr>
-          <w:rFonts w:ascii="Garamond" w:hAnsi="Garamond"/>
-          <w:szCs w:val="22"/>
-          <w:lang w:val="es-EC"/>
-        </w:rPr>
-      </w:r>
-      <w:r>
-        <w:rPr>
-          <w:rFonts w:ascii="Garamond" w:hAnsi="Garamond"/>
-          <w:szCs w:val="22"/>
-          <w:lang w:val="es-EC"/>
-        </w:rPr>
-        <w:instrText xml:space="preserve"> \* MERGEFORMAT </w:instrText>
+        <w:instrText xml:space="preserve"> REF _Ref236061504 \h  \* MERGEFORMAT </w:instrText>
+      </w:r>
+      <w:r>
+        <w:rPr>
+          <w:rFonts w:ascii="Garamond" w:hAnsi="Garamond"/>
+          <w:szCs w:val="22"/>
+          <w:lang w:val="es-EC"/>
+        </w:rPr>
       </w:r>
       <w:r>
         <w:rPr>
@@ -26980,23 +25907,7 @@
           <w:szCs w:val="22"/>
           <w:lang w:val="es-EC"/>
         </w:rPr>
-        <w:t>. Estable</w:t>
-      </w:r>
-      <w:r>
-        <w:rPr>
-          <w:rFonts w:ascii="Garamond" w:hAnsi="Garamond"/>
-          <w:szCs w:val="22"/>
-          <w:lang w:val="es-EC"/>
-        </w:rPr>
-        <w:t>zca</w:t>
-      </w:r>
-      <w:r>
-        <w:rPr>
-          <w:rFonts w:ascii="Garamond" w:hAnsi="Garamond"/>
-          <w:szCs w:val="22"/>
-          <w:lang w:val="es-EC"/>
-        </w:rPr>
-        <w:t xml:space="preserve"> también </w:t>
+        <w:t xml:space="preserve">. Establezca también </w:t>
       </w:r>
       <w:proofErr w:type="spellStart"/>
       <w:r>
@@ -27084,15 +25995,7 @@
           <w:szCs w:val="22"/>
           <w:lang w:val="es-EC"/>
         </w:rPr>
-        <w:t xml:space="preserve"> años meteorológicos analizados (en este caso, 2012-2014)</w:t>
-      </w:r>
-      <w:r>
-        <w:rPr>
-          <w:rFonts w:ascii="Garamond" w:hAnsi="Garamond"/>
-          <w:szCs w:val="22"/>
-          <w:lang w:val="es-EC"/>
-        </w:rPr>
-        <w:t xml:space="preserve"> en un formato listo para inclusión en modelo</w:t>
+        <w:t xml:space="preserve"> años meteorológicos analizados (en este caso, 2012-2014) en un formato listo para inclusión en modelo</w:t>
       </w:r>
       <w:r>
         <w:rPr>
@@ -27150,7 +26053,7 @@
           <w:lang w:val="es-EC"/>
         </w:rPr>
         <w:drawing>
-          <wp:inline distT="0" distB="0" distL="0" distR="0" wp14:anchorId="5CCC5114" wp14:editId="2AA8590A">
+          <wp:inline distT="0" distB="0" distL="0" distR="0" wp14:anchorId="5CCC5114" wp14:editId="2034D477">
             <wp:extent cx="4283612" cy="1462708"/>
             <wp:effectExtent l="0" t="0" r="3175" b="4445"/>
             <wp:docPr id="1685984751" name="Picture 17"/>
@@ -27300,16 +26203,7 @@
           <w:szCs w:val="18"/>
           <w:lang w:val="es-EC"/>
         </w:rPr>
-        <w:t>Configura</w:t>
-      </w:r>
-      <w:r>
-        <w:rPr>
-          <w:rFonts w:ascii="Garamond" w:hAnsi="Garamond"/>
-          <w:sz w:val="18"/>
-          <w:szCs w:val="18"/>
-          <w:lang w:val="es-EC"/>
-        </w:rPr>
-        <w:t xml:space="preserve">ción del Seleccionador </w:t>
+        <w:t xml:space="preserve">Configuración del Seleccionador </w:t>
       </w:r>
       <w:proofErr w:type="spellStart"/>
       <w:r>
@@ -27329,25 +26223,7 @@
           <w:szCs w:val="18"/>
           <w:lang w:val="es-EC"/>
         </w:rPr>
-        <w:t xml:space="preserve"> en </w:t>
-      </w:r>
-      <w:r>
-        <w:rPr>
-          <w:rFonts w:ascii="Garamond" w:hAnsi="Garamond"/>
-          <w:sz w:val="18"/>
-          <w:szCs w:val="18"/>
-          <w:lang w:val="es-EC"/>
-        </w:rPr>
-        <w:t>su</w:t>
-      </w:r>
-      <w:r>
-        <w:rPr>
-          <w:rFonts w:ascii="Garamond" w:hAnsi="Garamond"/>
-          <w:sz w:val="18"/>
-          <w:szCs w:val="18"/>
-          <w:lang w:val="es-EC"/>
-        </w:rPr>
-        <w:t xml:space="preserve"> </w:t>
+        <w:t xml:space="preserve"> en su </w:t>
       </w:r>
       <w:r>
         <w:rPr>
@@ -27864,25 +26740,7 @@
           <w:iCs/>
           <w:lang w:val="es-EC"/>
         </w:rPr>
-        <w:t xml:space="preserve">Flujo de trabajo del </w:t>
-      </w:r>
-      <w:r>
-        <w:rPr>
-          <w:rFonts w:ascii="Garamond" w:hAnsi="Garamond"/>
-          <w:i/>
-          <w:iCs/>
-          <w:lang w:val="es-EC"/>
-        </w:rPr>
-        <w:t>Seleccionador</w:t>
-      </w:r>
-      <w:r>
-        <w:rPr>
-          <w:rFonts w:ascii="Garamond" w:hAnsi="Garamond"/>
-          <w:i/>
-          <w:iCs/>
-          <w:lang w:val="es-EC"/>
-        </w:rPr>
-        <w:t xml:space="preserve"> completado</w:t>
+        <w:t>Flujo de trabajo del Seleccionador completado</w:t>
       </w:r>
       <w:r>
         <w:rPr>
@@ -27954,14 +26812,7 @@
           <w:rFonts w:ascii="Garamond" w:hAnsi="Garamond"/>
           <w:lang w:val="es-EC"/>
         </w:rPr>
-        <w:t xml:space="preserve"> </w:t>
-      </w:r>
-      <w:r>
-        <w:rPr>
-          <w:rFonts w:ascii="Garamond" w:hAnsi="Garamond"/>
-          <w:lang w:val="es-EC"/>
-        </w:rPr>
-        <w:t xml:space="preserve">Aquí, los resultados se guardan en la subcarpeta </w:t>
+        <w:t xml:space="preserve"> Aquí, los resultados se guardan en la subcarpeta </w:t>
       </w:r>
       <w:r>
         <w:rPr>
@@ -27980,14 +26831,7 @@
           <w:rFonts w:ascii="Garamond" w:hAnsi="Garamond"/>
           <w:lang w:val="es-EC"/>
         </w:rPr>
-        <w:t>, donde se crean los siguientes archivos:</w:t>
-      </w:r>
-      <w:r>
-        <w:rPr>
-          <w:rFonts w:ascii="Garamond" w:hAnsi="Garamond"/>
-          <w:lang w:val="es-EC"/>
-        </w:rPr>
-        <w:t xml:space="preserve"> </w:t>
+        <w:t xml:space="preserve">, donde se crean los siguientes archivos: </w:t>
       </w:r>
     </w:p>
     <w:p>
@@ -28052,21 +26896,7 @@
           <w:rFonts w:ascii="Garamond" w:hAnsi="Garamond"/>
           <w:lang w:val="es-EC"/>
         </w:rPr>
-        <w:t xml:space="preserve">s MSR </w:t>
-      </w:r>
-      <w:r>
-        <w:rPr>
-          <w:rFonts w:ascii="Garamond" w:hAnsi="Garamond"/>
-          <w:lang w:val="es-EC"/>
-        </w:rPr>
-        <w:t>“</w:t>
-      </w:r>
-      <w:r>
-        <w:rPr>
-          <w:rFonts w:ascii="Garamond" w:hAnsi="Garamond"/>
-          <w:lang w:val="es-EC"/>
-        </w:rPr>
-        <w:t>mejor clasificad</w:t>
+        <w:t>s MSR “mejor clasificad</w:t>
       </w:r>
       <w:r>
         <w:rPr>
@@ -28080,21 +26910,7 @@
           <w:rFonts w:ascii="Garamond" w:hAnsi="Garamond"/>
           <w:lang w:val="es-EC"/>
         </w:rPr>
-        <w:t>s</w:t>
-      </w:r>
-      <w:r>
-        <w:rPr>
-          <w:rFonts w:ascii="Garamond" w:hAnsi="Garamond"/>
-          <w:lang w:val="es-EC"/>
-        </w:rPr>
-        <w:t>”</w:t>
-      </w:r>
-      <w:r>
-        <w:rPr>
-          <w:rFonts w:ascii="Garamond" w:hAnsi="Garamond"/>
-          <w:lang w:val="es-EC"/>
-        </w:rPr>
-        <w:t xml:space="preserve"> para la energía solar y </w:t>
+        <w:t xml:space="preserve">s” para la energía solar y </w:t>
       </w:r>
       <w:r>
         <w:rPr>
@@ -28108,14 +26924,7 @@
           <w:rFonts w:ascii="Garamond" w:hAnsi="Garamond"/>
           <w:lang w:val="es-EC"/>
         </w:rPr>
-        <w:t>eólica;</w:t>
-      </w:r>
-      <w:r>
-        <w:rPr>
-          <w:rFonts w:ascii="Garamond" w:hAnsi="Garamond"/>
-          <w:lang w:val="es-EC"/>
-        </w:rPr>
-        <w:t xml:space="preserve"> </w:t>
+        <w:t xml:space="preserve">eólica; </w:t>
       </w:r>
     </w:p>
     <w:p>
@@ -28238,14 +27047,7 @@
           <w:rFonts w:ascii="Garamond" w:hAnsi="Garamond"/>
           <w:lang w:val="es-EC"/>
         </w:rPr>
-        <w:t>s</w:t>
-      </w:r>
-      <w:r>
-        <w:rPr>
-          <w:rFonts w:ascii="Garamond" w:hAnsi="Garamond"/>
-          <w:lang w:val="es-EC"/>
-        </w:rPr>
-        <w:t>hapefile</w:t>
+        <w:t>shapefile</w:t>
       </w:r>
       <w:proofErr w:type="spellEnd"/>
       <w:r>
@@ -28390,14 +27192,7 @@
           <w:rFonts w:ascii="Garamond" w:hAnsi="Garamond"/>
           <w:lang w:val="es-EC"/>
         </w:rPr>
-        <w:t>?</w:t>
-      </w:r>
-      <w:r>
-        <w:rPr>
-          <w:rFonts w:ascii="Garamond" w:hAnsi="Garamond"/>
-          <w:lang w:val="es-EC"/>
-        </w:rPr>
-        <w:t xml:space="preserve"> </w:t>
+        <w:t xml:space="preserve">? </w:t>
       </w:r>
     </w:p>
     <w:p>
@@ -28427,21 +27222,7 @@
           <w:rFonts w:ascii="Garamond" w:hAnsi="Garamond"/>
           <w:lang w:val="es-EC"/>
         </w:rPr>
-        <w:t>Ech</w:t>
-      </w:r>
-      <w:r>
-        <w:rPr>
-          <w:rFonts w:ascii="Garamond" w:hAnsi="Garamond"/>
-          <w:lang w:val="es-EC"/>
-        </w:rPr>
-        <w:t>e</w:t>
-      </w:r>
-      <w:r>
-        <w:rPr>
-          <w:rFonts w:ascii="Garamond" w:hAnsi="Garamond"/>
-          <w:lang w:val="es-EC"/>
-        </w:rPr>
-        <w:t xml:space="preserve"> un vistazo a las series temporales de salida en los archivos .</w:t>
+        <w:t>Eche un vistazo a las series temporales de salida en los archivos .</w:t>
       </w:r>
       <w:proofErr w:type="spellStart"/>
       <w:r>
@@ -28457,51 +27238,15 @@
           <w:rFonts w:ascii="Garamond" w:hAnsi="Garamond"/>
           <w:lang w:val="es-EC"/>
         </w:rPr>
-        <w:t xml:space="preserve"> generados. L</w:t>
-      </w:r>
-      <w:r>
-        <w:rPr>
-          <w:rFonts w:ascii="Garamond" w:hAnsi="Garamond"/>
-          <w:lang w:val="es-EC"/>
-        </w:rPr>
-        <w:t>a</w:t>
-      </w:r>
-      <w:r>
-        <w:rPr>
-          <w:rFonts w:ascii="Garamond" w:hAnsi="Garamond"/>
-          <w:lang w:val="es-EC"/>
-        </w:rPr>
-        <w:t>s MSR mejor clasificad</w:t>
-      </w:r>
-      <w:r>
-        <w:rPr>
-          <w:rFonts w:ascii="Garamond" w:hAnsi="Garamond"/>
-          <w:lang w:val="es-EC"/>
-        </w:rPr>
-        <w:t>a</w:t>
-      </w:r>
-      <w:r>
-        <w:rPr>
-          <w:rFonts w:ascii="Garamond" w:hAnsi="Garamond"/>
-          <w:lang w:val="es-EC"/>
-        </w:rPr>
-        <w:t xml:space="preserve">s se muestran en columnas, como se ve </w:t>
-      </w:r>
-      <w:r>
-        <w:rPr>
-          <w:rFonts w:ascii="Garamond" w:hAnsi="Garamond"/>
-          <w:szCs w:val="22"/>
-          <w:lang w:val="es-EC"/>
-        </w:rPr>
-        <w:t>en la</w:t>
-      </w:r>
-      <w:r>
-        <w:rPr>
-          <w:rFonts w:ascii="Garamond" w:hAnsi="Garamond"/>
-          <w:szCs w:val="22"/>
-          <w:lang w:val="es-EC"/>
-        </w:rPr>
-        <w:t xml:space="preserve"> </w:t>
+        <w:t xml:space="preserve"> generados. Las MSR mejor clasificadas se muestran en columnas, como se ve </w:t>
+      </w:r>
+      <w:r>
+        <w:rPr>
+          <w:rFonts w:ascii="Garamond" w:hAnsi="Garamond"/>
+          <w:szCs w:val="22"/>
+          <w:lang w:val="es-EC"/>
+        </w:rPr>
+        <w:t xml:space="preserve">en la </w:t>
       </w:r>
       <w:r>
         <w:rPr>
@@ -28517,22 +27262,14 @@
           <w:szCs w:val="22"/>
           <w:lang w:val="es-EC"/>
         </w:rPr>
-        <w:instrText xml:space="preserve"> REF _Ref236062325 \h </w:instrText>
-      </w:r>
-      <w:r>
-        <w:rPr>
-          <w:rFonts w:ascii="Garamond" w:hAnsi="Garamond"/>
-          <w:szCs w:val="22"/>
-          <w:lang w:val="es-EC"/>
-        </w:rPr>
-      </w:r>
-      <w:r>
-        <w:rPr>
-          <w:rFonts w:ascii="Garamond" w:hAnsi="Garamond"/>
-          <w:szCs w:val="22"/>
-          <w:lang w:val="es-EC"/>
-        </w:rPr>
-        <w:instrText xml:space="preserve"> \* MERGEFORMAT </w:instrText>
+        <w:instrText xml:space="preserve"> REF _Ref236062325 \h  \* MERGEFORMAT </w:instrText>
+      </w:r>
+      <w:r>
+        <w:rPr>
+          <w:rFonts w:ascii="Garamond" w:hAnsi="Garamond"/>
+          <w:szCs w:val="22"/>
+          <w:lang w:val="es-EC"/>
+        </w:rPr>
       </w:r>
       <w:r>
         <w:rPr>
@@ -28586,49 +27323,7 @@
           <w:rFonts w:ascii="Garamond" w:hAnsi="Garamond"/>
           <w:lang w:val="es-EC"/>
         </w:rPr>
-        <w:t xml:space="preserve"> des</w:t>
-      </w:r>
-      <w:r>
-        <w:rPr>
-          <w:rFonts w:ascii="Garamond" w:hAnsi="Garamond"/>
-          <w:lang w:val="es-EC"/>
-        </w:rPr>
-        <w:t>lizar</w:t>
-      </w:r>
-      <w:r>
-        <w:rPr>
-          <w:rFonts w:ascii="Garamond" w:hAnsi="Garamond"/>
-          <w:lang w:val="es-EC"/>
-        </w:rPr>
-        <w:t xml:space="preserve"> hacia abajo,</w:t>
-      </w:r>
-      <w:r>
-        <w:rPr>
-          <w:rFonts w:ascii="Garamond" w:hAnsi="Garamond"/>
-          <w:lang w:val="es-EC"/>
-        </w:rPr>
-        <w:t xml:space="preserve"> se</w:t>
-      </w:r>
-      <w:r>
-        <w:rPr>
-          <w:rFonts w:ascii="Garamond" w:hAnsi="Garamond"/>
-          <w:lang w:val="es-EC"/>
-        </w:rPr>
-        <w:t xml:space="preserve"> encontrará</w:t>
-      </w:r>
-      <w:r>
-        <w:rPr>
-          <w:rFonts w:ascii="Garamond" w:hAnsi="Garamond"/>
-          <w:lang w:val="es-EC"/>
-        </w:rPr>
-        <w:t>n</w:t>
-      </w:r>
-      <w:r>
-        <w:rPr>
-          <w:rFonts w:ascii="Garamond" w:hAnsi="Garamond"/>
-          <w:lang w:val="es-EC"/>
-        </w:rPr>
-        <w:t xml:space="preserve"> (a partir de la fila 68) las </w:t>
+        <w:t xml:space="preserve"> deslizar hacia abajo, se encontrarán (a partir de la fila 68) las </w:t>
       </w:r>
       <w:r>
         <w:rPr>
@@ -28644,14 +27339,7 @@
           <w:rFonts w:ascii="Garamond" w:hAnsi="Garamond"/>
           <w:lang w:val="es-EC"/>
         </w:rPr>
-        <w:t xml:space="preserve"> a lo largo del período analizado.</w:t>
-      </w:r>
-      <w:r>
-        <w:rPr>
-          <w:rFonts w:ascii="Garamond" w:hAnsi="Garamond"/>
-          <w:lang w:val="es-EC"/>
-        </w:rPr>
-        <w:t xml:space="preserve"> </w:t>
+        <w:t xml:space="preserve"> a lo largo del período analizado. </w:t>
       </w:r>
     </w:p>
     <w:p>
@@ -28817,70 +27505,7 @@
           <w:szCs w:val="18"/>
           <w:lang w:val="es-EC"/>
         </w:rPr>
-        <w:t xml:space="preserve">: </w:t>
-      </w:r>
-      <w:r>
-        <w:rPr>
-          <w:rFonts w:ascii="Garamond" w:hAnsi="Garamond"/>
-          <w:sz w:val="18"/>
-          <w:szCs w:val="18"/>
-          <w:lang w:val="es-EC"/>
-        </w:rPr>
-        <w:t>Perfiles horarios completos de l</w:t>
-      </w:r>
-      <w:r>
-        <w:rPr>
-          <w:rFonts w:ascii="Garamond" w:hAnsi="Garamond"/>
-          <w:sz w:val="18"/>
-          <w:szCs w:val="18"/>
-          <w:lang w:val="es-EC"/>
-        </w:rPr>
-        <w:t>a</w:t>
-      </w:r>
-      <w:r>
-        <w:rPr>
-          <w:rFonts w:ascii="Garamond" w:hAnsi="Garamond"/>
-          <w:sz w:val="18"/>
-          <w:szCs w:val="18"/>
-          <w:lang w:val="es-EC"/>
-        </w:rPr>
-        <w:t xml:space="preserve">s MSR </w:t>
-      </w:r>
-      <w:r>
-        <w:rPr>
-          <w:rFonts w:ascii="Garamond" w:hAnsi="Garamond"/>
-          <w:sz w:val="18"/>
-          <w:szCs w:val="18"/>
-          <w:lang w:val="es-EC"/>
-        </w:rPr>
-        <w:t>“</w:t>
-      </w:r>
-      <w:r>
-        <w:rPr>
-          <w:rFonts w:ascii="Garamond" w:hAnsi="Garamond"/>
-          <w:sz w:val="18"/>
-          <w:szCs w:val="18"/>
-          <w:lang w:val="es-EC"/>
-        </w:rPr>
-        <w:t>mejor clasificad</w:t>
-      </w:r>
-      <w:r>
-        <w:rPr>
-          <w:rFonts w:ascii="Garamond" w:hAnsi="Garamond"/>
-          <w:sz w:val="18"/>
-          <w:szCs w:val="18"/>
-          <w:lang w:val="es-EC"/>
-        </w:rPr>
-        <w:t>as”</w:t>
-      </w:r>
-      <w:r>
-        <w:rPr>
-          <w:rFonts w:ascii="Garamond" w:hAnsi="Garamond"/>
-          <w:sz w:val="18"/>
-          <w:szCs w:val="18"/>
-          <w:lang w:val="es-EC"/>
-        </w:rPr>
-        <w:t xml:space="preserve"> (ejemplo para energía solar fotovoltaica).</w:t>
+        <w:t>: Perfiles horarios completos de las MSR “mejor clasificadas” (ejemplo para energía solar fotovoltaica).</w:t>
       </w:r>
     </w:p>
     <w:p>
@@ -30890,6 +29515,7 @@
   <w:style w:type="character" w:default="1" w:styleId="DefaultParagraphFont">
     <w:name w:val="Default Paragraph Font"/>
     <w:uiPriority w:val="1"/>
+    <w:semiHidden/>
     <w:unhideWhenUsed/>
   </w:style>
   <w:style w:type="table" w:default="1" w:styleId="TableNormal">

</xml_diff>

<commit_message>
update training dataset to include Zenodo link for data obtention
</commit_message>
<xml_diff>
--- a/training/MSR_framework_training_ES.docx
+++ b/training/MSR_framework_training_ES.docx
@@ -1,6 +1,6 @@
 
 <file path=word/document.xml><?xml version="1.0" encoding="utf-8"?>
-<w:document xmlns:wpc="http://schemas.microsoft.com/office/word/2010/wordprocessingCanvas" xmlns:cx="http://schemas.microsoft.com/office/drawing/2014/chartex" xmlns:cx1="http://schemas.microsoft.com/office/drawing/2015/9/8/chartex" xmlns:cx2="http://schemas.microsoft.com/office/drawing/2015/10/21/chartex" xmlns:cx3="http://schemas.microsoft.com/office/drawing/2016/5/9/chartex" xmlns:cx4="http://schemas.microsoft.com/office/drawing/2016/5/10/chartex" xmlns:cx5="http://schemas.microsoft.com/office/drawing/2016/5/11/chartex" xmlns:cx6="http://schemas.microsoft.com/office/drawing/2016/5/12/chartex" xmlns:cx7="http://schemas.microsoft.com/office/drawing/2016/5/13/chartex" xmlns:cx8="http://schemas.microsoft.com/office/drawing/2016/5/14/chartex" xmlns:mc="http://schemas.openxmlformats.org/markup-compatibility/2006" xmlns:aink="http://schemas.microsoft.com/office/drawing/2016/ink" xmlns:am3d="http://schemas.microsoft.com/office/drawing/2017/model3d" xmlns:o="urn:schemas-microsoft-com:office:office" xmlns:oel="http://schemas.microsoft.com/office/2019/extlst" xmlns:r="http://schemas.openxmlformats.org/officeDocument/2006/relationships" xmlns:m="http://schemas.openxmlformats.org/officeDocument/2006/math" xmlns:v="urn:schemas-microsoft-com:vml" xmlns:wp14="http://schemas.microsoft.com/office/word/2010/wordprocessingDrawing" xmlns:wp="http://schemas.openxmlformats.org/drawingml/2006/wordprocessingDrawing" xmlns:w10="urn:schemas-microsoft-com:office:word" xmlns:w="http://schemas.openxmlformats.org/wordprocessingml/2006/main" xmlns:w14="http://schemas.microsoft.com/office/word/2010/wordml" xmlns:w15="http://schemas.microsoft.com/office/word/2012/wordml" xmlns:w16cei="http://schemas.microsoft.com/office/word/2026/wordml/cei" xmlns:w16cex="http://schemas.microsoft.com/office/word/2018/wordml/cex" xmlns:w16cid="http://schemas.microsoft.com/office/word/2016/wordml/cid" xmlns:w16="http://schemas.microsoft.com/office/word/2018/wordml" xmlns:w16du="http://schemas.microsoft.com/office/word/2023/wordml/word16du" xmlns:w16sdtdh="http://schemas.microsoft.com/office/word/2020/wordml/sdtdatahash" xmlns:w16sdtfl="http://schemas.microsoft.com/office/word/2024/wordml/sdtformatlock" xmlns:w16se="http://schemas.microsoft.com/office/word/2015/wordml/symex" xmlns:wpg="http://schemas.microsoft.com/office/word/2010/wordprocessingGroup" xmlns:wpi="http://schemas.microsoft.com/office/word/2010/wordprocessingInk" xmlns:wne="http://schemas.microsoft.com/office/word/2006/wordml" xmlns:wps="http://schemas.microsoft.com/office/word/2010/wordprocessingShape" mc:Ignorable="w14 w15 w16se w16cid w16 w16cex w16sdtdh w16sdtfl w16du wp14">
+<w:document xmlns:wpc="http://schemas.microsoft.com/office/word/2010/wordprocessingCanvas" xmlns:cx="http://schemas.microsoft.com/office/drawing/2014/chartex" xmlns:cx1="http://schemas.microsoft.com/office/drawing/2015/9/8/chartex" xmlns:cx2="http://schemas.microsoft.com/office/drawing/2015/10/21/chartex" xmlns:cx3="http://schemas.microsoft.com/office/drawing/2016/5/9/chartex" xmlns:cx4="http://schemas.microsoft.com/office/drawing/2016/5/10/chartex" xmlns:cx5="http://schemas.microsoft.com/office/drawing/2016/5/11/chartex" xmlns:cx6="http://schemas.microsoft.com/office/drawing/2016/5/12/chartex" xmlns:cx7="http://schemas.microsoft.com/office/drawing/2016/5/13/chartex" xmlns:cx8="http://schemas.microsoft.com/office/drawing/2016/5/14/chartex" xmlns:mc="http://schemas.openxmlformats.org/markup-compatibility/2006" xmlns:aink="http://schemas.microsoft.com/office/drawing/2016/ink" xmlns:am3d="http://schemas.microsoft.com/office/drawing/2017/model3d" xmlns:o="urn:schemas-microsoft-com:office:office" xmlns:oel="http://schemas.microsoft.com/office/2019/extlst" xmlns:r="http://schemas.openxmlformats.org/officeDocument/2006/relationships" xmlns:m="http://schemas.openxmlformats.org/officeDocument/2006/math" xmlns:v="urn:schemas-microsoft-com:vml" xmlns:wp14="http://schemas.microsoft.com/office/word/2010/wordprocessingDrawing" xmlns:wp="http://schemas.openxmlformats.org/drawingml/2006/wordprocessingDrawing" xmlns:w10="urn:schemas-microsoft-com:office:word" xmlns:w="http://schemas.openxmlformats.org/wordprocessingml/2006/main" xmlns:w14="http://schemas.microsoft.com/office/word/2010/wordml" xmlns:w15="http://schemas.microsoft.com/office/word/2012/wordml" xmlns:w16cex="http://schemas.microsoft.com/office/word/2018/wordml/cex" xmlns:w16cid="http://schemas.microsoft.com/office/word/2016/wordml/cid" xmlns:w16="http://schemas.microsoft.com/office/word/2018/wordml" xmlns:w16du="http://schemas.microsoft.com/office/word/2023/wordml/word16du" xmlns:w16sdtdh="http://schemas.microsoft.com/office/word/2020/wordml/sdtdatahash" xmlns:w16sdtfl="http://schemas.microsoft.com/office/word/2024/wordml/sdtformatlock" xmlns:w16se="http://schemas.microsoft.com/office/word/2015/wordml/symex" xmlns:wpg="http://schemas.microsoft.com/office/word/2010/wordprocessingGroup" xmlns:wpi="http://schemas.microsoft.com/office/word/2010/wordprocessingInk" xmlns:wne="http://schemas.microsoft.com/office/word/2006/wordml" xmlns:wps="http://schemas.microsoft.com/office/word/2010/wordprocessingShape" mc:Ignorable="w14 w15 w16se w16cid w16 w16cex w16sdtdh w16sdtfl w16du wp14">
   <w:body>
     <w:p>
       <w:pPr>
@@ -4051,7 +4051,28 @@
           <w:rFonts w:ascii="Garamond" w:hAnsi="Garamond"/>
           <w:lang w:val="es-EC"/>
         </w:rPr>
-        <w:t xml:space="preserve">Las capas de infraestructura y características del terreno son conjuntos de datos de entrada almacenados en la carpeta </w:t>
+        <w:t>Las capas de infraestructura y características del terreno son conjuntos de datos de entrada</w:t>
+      </w:r>
+      <w:r>
+        <w:rPr>
+          <w:rFonts w:ascii="Garamond" w:hAnsi="Garamond"/>
+          <w:lang w:val="es-EC"/>
+        </w:rPr>
+        <w:t>—</w:t>
+      </w:r>
+      <w:r>
+        <w:rPr>
+          <w:rFonts w:ascii="Garamond" w:hAnsi="Garamond"/>
+          <w:lang w:val="es-EC"/>
+        </w:rPr>
+        <w:t xml:space="preserve">que deberán ser </w:t>
+      </w:r>
+      <w:r>
+        <w:rPr>
+          <w:rFonts w:ascii="Garamond" w:hAnsi="Garamond"/>
+          <w:lang w:val="es-EC"/>
+        </w:rPr>
+        <w:t xml:space="preserve">almacenados en la carpeta </w:t>
       </w:r>
       <w:r>
         <w:rPr>
@@ -4070,7 +4091,14 @@
           <w:rFonts w:ascii="Garamond" w:hAnsi="Garamond"/>
           <w:lang w:val="es-EC"/>
         </w:rPr>
-        <w:t xml:space="preserve">, que describen las </w:t>
+        <w:t>—</w:t>
+      </w:r>
+      <w:r>
+        <w:rPr>
+          <w:rFonts w:ascii="Garamond" w:hAnsi="Garamond"/>
+          <w:lang w:val="es-EC"/>
+        </w:rPr>
+        <w:t xml:space="preserve">que describen las </w:t>
       </w:r>
       <w:r>
         <w:rPr>
@@ -4119,6 +4147,85 @@
           <w:lang w:val="es-EC"/>
         </w:rPr>
         <w:t>renovables.</w:t>
+      </w:r>
+    </w:p>
+    <w:p>
+      <w:pPr>
+        <w:rPr>
+          <w:rFonts w:ascii="Garamond" w:hAnsi="Garamond"/>
+          <w:lang w:val="es-EC"/>
+        </w:rPr>
+      </w:pPr>
+    </w:p>
+    <w:p>
+      <w:pPr>
+        <w:rPr>
+          <w:rFonts w:ascii="Garamond" w:hAnsi="Garamond"/>
+          <w:lang w:val="es-EC"/>
+        </w:rPr>
+      </w:pPr>
+      <w:r>
+        <w:rPr>
+          <w:rFonts w:ascii="Garamond" w:hAnsi="Garamond"/>
+          <w:lang w:val="es-EC"/>
+        </w:rPr>
+        <w:t xml:space="preserve">Para obtener los conjuntos de datos de entrada, por favor consulte </w:t>
+      </w:r>
+      <w:r>
+        <w:rPr>
+          <w:rFonts w:ascii="Garamond" w:hAnsi="Garamond"/>
+          <w:lang w:val="es-EC"/>
+        </w:rPr>
+        <w:t>las instrucciones d</w:t>
+      </w:r>
+      <w:r>
+        <w:rPr>
+          <w:rFonts w:ascii="Garamond" w:hAnsi="Garamond"/>
+          <w:lang w:val="es-EC"/>
+        </w:rPr>
+        <w:t xml:space="preserve">el documento </w:t>
+      </w:r>
+      <w:r>
+        <w:rPr>
+          <w:rFonts w:ascii="Garamond" w:hAnsi="Garamond"/>
+          <w:b/>
+          <w:bCs/>
+          <w:i/>
+          <w:iCs/>
+          <w:color w:val="00B050"/>
+          <w:lang w:val="es-EC"/>
+        </w:rPr>
+        <w:t xml:space="preserve">README </w:t>
+      </w:r>
+      <w:r>
+        <w:rPr>
+          <w:rFonts w:ascii="Garamond" w:hAnsi="Garamond"/>
+          <w:lang w:val="es-EC"/>
+        </w:rPr>
+        <w:t>en el repositorio</w:t>
+      </w:r>
+      <w:r>
+        <w:rPr>
+          <w:rFonts w:ascii="Garamond" w:hAnsi="Garamond"/>
+          <w:lang w:val="es-EC"/>
+        </w:rPr>
+        <w:t xml:space="preserve">, y use el enlace </w:t>
+      </w:r>
+      <w:proofErr w:type="spellStart"/>
+      <w:r>
+        <w:rPr>
+          <w:rFonts w:ascii="Garamond" w:hAnsi="Garamond"/>
+          <w:lang w:val="es-EC"/>
+        </w:rPr>
+        <w:t>Zenodo</w:t>
+      </w:r>
+      <w:proofErr w:type="spellEnd"/>
+      <w:r>
+        <w:rPr>
+          <w:rFonts w:ascii="Garamond" w:hAnsi="Garamond"/>
+          <w:lang w:val="es-EC"/>
+        </w:rPr>
+        <w:t xml:space="preserve"> proporcionado.</w:t>
       </w:r>
     </w:p>
     <w:p>
@@ -7497,7 +7604,7 @@
         </w:rPr>
         <w:lastRenderedPageBreak/>
         <w:drawing>
-          <wp:inline distT="0" distB="0" distL="0" distR="0" wp14:anchorId="5D2A6092" wp14:editId="6DEE68A6">
+          <wp:inline distT="0" distB="0" distL="0" distR="0" wp14:anchorId="5D2A6092" wp14:editId="6C6E85CB">
             <wp:extent cx="5725795" cy="2320925"/>
             <wp:effectExtent l="0" t="0" r="8255" b="3175"/>
             <wp:docPr id="872326584" name="Picture 2"/>
@@ -8073,7 +8180,7 @@
           <w:lang w:val="es-EC"/>
         </w:rPr>
         <w:drawing>
-          <wp:inline distT="0" distB="0" distL="0" distR="0" wp14:anchorId="7DF1563D" wp14:editId="2D3F3C05">
+          <wp:inline distT="0" distB="0" distL="0" distR="0" wp14:anchorId="7DF1563D" wp14:editId="642B4E7A">
             <wp:extent cx="4923692" cy="2074427"/>
             <wp:effectExtent l="0" t="0" r="0" b="2540"/>
             <wp:docPr id="2075218623" name="Picture 3"/>
@@ -9208,7 +9315,7 @@
               </wp:inline>
             </w:drawing>
           </mc:Choice>
-          <mc:Fallback>
+          <mc:Fallback xmlns:w16cei="http://schemas.microsoft.com/office/word/2026/wordml/cei">
             <w:pict>
               <v:shapetype w14:anchorId="4F94FF0D" id="_x0000_t202" coordsize="21600,21600" o:spt="202" path="m,l,21600r21600,l21600,xe">
                 <v:stroke joinstyle="miter"/>
@@ -10608,7 +10715,7 @@
           <w:lang w:val="es-EC"/>
         </w:rPr>
         <w:drawing>
-          <wp:inline distT="0" distB="0" distL="0" distR="0" wp14:anchorId="3C266C2A" wp14:editId="71A6F62E">
+          <wp:inline distT="0" distB="0" distL="0" distR="0" wp14:anchorId="3C266C2A" wp14:editId="769C45B6">
             <wp:extent cx="3416300" cy="2271095"/>
             <wp:effectExtent l="0" t="0" r="0" b="0"/>
             <wp:docPr id="1712662771" name="Picture 18"/>
@@ -11724,7 +11831,7 @@
               </wp:inline>
             </w:drawing>
           </mc:Choice>
-          <mc:Fallback>
+          <mc:Fallback xmlns:w16cei="http://schemas.microsoft.com/office/word/2026/wordml/cei">
             <w:pict>
               <v:shape w14:anchorId="455C371F" id="_x0000_s1027" type="#_x0000_t202" style="width:451.3pt;height:56.45pt;visibility:visible;mso-wrap-style:square;mso-left-percent:-10001;mso-top-percent:-10001;mso-position-horizontal:absolute;mso-position-horizontal-relative:char;mso-position-vertical:absolute;mso-position-vertical-relative:line;mso-left-percent:-10001;mso-top-percent:-10001;v-text-anchor:top" o:gfxdata="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" fillcolor="#fdf4d2 [663]" strokeweight="1.25pt">
                 <v:textbox>
@@ -12451,7 +12558,7 @@
           <w:lang w:val="es-EC"/>
         </w:rPr>
         <w:drawing>
-          <wp:inline distT="0" distB="0" distL="0" distR="0" wp14:anchorId="4D499EA3" wp14:editId="33161817">
+          <wp:inline distT="0" distB="0" distL="0" distR="0" wp14:anchorId="4D499EA3" wp14:editId="23C924FA">
             <wp:extent cx="3435914" cy="2381250"/>
             <wp:effectExtent l="0" t="0" r="0" b="0"/>
             <wp:docPr id="1429674699" name="Picture 19"/>
@@ -12991,7 +13098,7 @@
         </w:rPr>
         <w:lastRenderedPageBreak/>
         <w:drawing>
-          <wp:inline distT="0" distB="0" distL="0" distR="0" wp14:anchorId="00F48468" wp14:editId="3B0E6A70">
+          <wp:inline distT="0" distB="0" distL="0" distR="0" wp14:anchorId="00F48468" wp14:editId="0A0603B6">
             <wp:extent cx="3363402" cy="2235930"/>
             <wp:effectExtent l="0" t="0" r="8890" b="0"/>
             <wp:docPr id="1170893738" name="Picture 21"/>
@@ -13859,7 +13966,7 @@
               </wp:inline>
             </w:drawing>
           </mc:Choice>
-          <mc:Fallback>
+          <mc:Fallback xmlns:w16cei="http://schemas.microsoft.com/office/word/2026/wordml/cei">
             <w:pict>
               <v:shape w14:anchorId="75B0CCEA" id="_x0000_s1028" type="#_x0000_t202" style="width:451.3pt;height:51.95pt;visibility:visible;mso-wrap-style:square;mso-left-percent:-10001;mso-top-percent:-10001;mso-position-horizontal:absolute;mso-position-horizontal-relative:char;mso-position-vertical:absolute;mso-position-vertical-relative:line;mso-left-percent:-10001;mso-top-percent:-10001;v-text-anchor:top" o:gfxdata="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" fillcolor="#fdf4d2 [663]" strokeweight="1.25pt">
                 <v:textbox>
@@ -15808,7 +15915,7 @@
               </wp:inline>
             </w:drawing>
           </mc:Choice>
-          <mc:Fallback>
+          <mc:Fallback xmlns:w16cei="http://schemas.microsoft.com/office/word/2026/wordml/cei">
             <w:pict>
               <v:shape w14:anchorId="6E2DE549" id="_x0000_s1029" type="#_x0000_t202" style="width:451.3pt;height:260.2pt;visibility:visible;mso-wrap-style:square;mso-left-percent:-10001;mso-top-percent:-10001;mso-position-horizontal:absolute;mso-position-horizontal-relative:char;mso-position-vertical:absolute;mso-position-vertical-relative:line;mso-left-percent:-10001;mso-top-percent:-10001;v-text-anchor:top" o:gfxdata="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" fillcolor="#fdf4d2 [663]" strokeweight="1.25pt">
                 <v:textbox>
@@ -17431,7 +17538,7 @@
           <w:lang w:val="es-EC"/>
         </w:rPr>
         <w:drawing>
-          <wp:inline distT="0" distB="0" distL="0" distR="0" wp14:anchorId="67B731F2" wp14:editId="5464D363">
+          <wp:inline distT="0" distB="0" distL="0" distR="0" wp14:anchorId="67B731F2" wp14:editId="69234B20">
             <wp:extent cx="5725160" cy="2305685"/>
             <wp:effectExtent l="0" t="0" r="8890" b="0"/>
             <wp:docPr id="1945377732" name="Picture 5"/>
@@ -18492,7 +18599,7 @@
               </wp:inline>
             </w:drawing>
           </mc:Choice>
-          <mc:Fallback>
+          <mc:Fallback xmlns:w16cei="http://schemas.microsoft.com/office/word/2026/wordml/cei">
             <w:pict>
               <v:shape w14:anchorId="7609F3B9" id="_x0000_s1030" type="#_x0000_t202" style="width:451.3pt;height:53.7pt;visibility:visible;mso-wrap-style:square;mso-left-percent:-10001;mso-top-percent:-10001;mso-position-horizontal:absolute;mso-position-horizontal-relative:char;mso-position-vertical:absolute;mso-position-vertical-relative:line;mso-left-percent:-10001;mso-top-percent:-10001;v-text-anchor:top" o:gfxdata="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" fillcolor="#fdf4d2 [663]" strokeweight="1.25pt">
                 <v:textbox>
@@ -19782,7 +19889,7 @@
               </wp:inline>
             </w:drawing>
           </mc:Choice>
-          <mc:Fallback>
+          <mc:Fallback xmlns:w16cei="http://schemas.microsoft.com/office/word/2026/wordml/cei">
             <w:pict>
               <v:shape w14:anchorId="054850AD" id="_x0000_s1031" type="#_x0000_t202" style="width:451.3pt;height:63.85pt;visibility:visible;mso-wrap-style:square;mso-left-percent:-10001;mso-top-percent:-10001;mso-position-horizontal:absolute;mso-position-horizontal-relative:char;mso-position-vertical:absolute;mso-position-vertical-relative:line;mso-left-percent:-10001;mso-top-percent:-10001;v-text-anchor:top" o:gfxdata="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" fillcolor="#fdf4d2 [663]" strokeweight="1.25pt">
                 <v:textbox>
@@ -21597,7 +21704,7 @@
               </wp:inline>
             </w:drawing>
           </mc:Choice>
-          <mc:Fallback>
+          <mc:Fallback xmlns:w16cei="http://schemas.microsoft.com/office/word/2026/wordml/cei">
             <w:pict>
               <v:shape w14:anchorId="69256AB5" id="_x0000_s1032" type="#_x0000_t202" style="width:451.3pt;height:53.7pt;visibility:visible;mso-wrap-style:square;mso-left-percent:-10001;mso-top-percent:-10001;mso-position-horizontal:absolute;mso-position-horizontal-relative:char;mso-position-vertical:absolute;mso-position-vertical-relative:line;mso-left-percent:-10001;mso-top-percent:-10001;v-text-anchor:top" o:gfxdata="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" fillcolor="#fdf4d2 [663]" strokeweight="1.25pt">
                 <v:textbox>
@@ -23140,7 +23247,7 @@
               </wp:inline>
             </w:drawing>
           </mc:Choice>
-          <mc:Fallback>
+          <mc:Fallback xmlns:w16cei="http://schemas.microsoft.com/office/word/2026/wordml/cei">
             <w:pict>
               <v:shape w14:anchorId="2994FDE6" id="_x0000_s1033" type="#_x0000_t202" style="width:451.3pt;height:53.7pt;visibility:visible;mso-wrap-style:square;mso-left-percent:-10001;mso-top-percent:-10001;mso-position-horizontal:absolute;mso-position-horizontal-relative:char;mso-position-vertical:absolute;mso-position-vertical-relative:line;mso-left-percent:-10001;mso-top-percent:-10001;v-text-anchor:top" o:gfxdata="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" fillcolor="#fdf4d2 [663]" strokeweight="1.25pt">
                 <v:textbox>
@@ -26119,7 +26226,7 @@
           <w:lang w:val="es-EC"/>
         </w:rPr>
         <w:drawing>
-          <wp:inline distT="0" distB="0" distL="0" distR="0" wp14:anchorId="5CCC5114" wp14:editId="0173D952">
+          <wp:inline distT="0" distB="0" distL="0" distR="0" wp14:anchorId="5CCC5114" wp14:editId="179C7AE4">
             <wp:extent cx="4283612" cy="1462708"/>
             <wp:effectExtent l="0" t="0" r="3175" b="4445"/>
             <wp:docPr id="1685984751" name="Picture 17"/>
@@ -26599,7 +26706,7 @@
               </wp:inline>
             </w:drawing>
           </mc:Choice>
-          <mc:Fallback>
+          <mc:Fallback xmlns:w16cei="http://schemas.microsoft.com/office/word/2026/wordml/cei">
             <w:pict>
               <v:shape w14:anchorId="33E50FD7" id="_x0000_s1034" type="#_x0000_t202" style="width:451.3pt;height:53.7pt;visibility:visible;mso-wrap-style:square;mso-left-percent:-10001;mso-top-percent:-10001;mso-position-horizontal:absolute;mso-position-horizontal-relative:char;mso-position-vertical:absolute;mso-position-vertical-relative:line;mso-left-percent:-10001;mso-top-percent:-10001;v-text-anchor:top" o:gfxdata="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" fillcolor="#fdf4d2 [663]" strokeweight="1.25pt">
                 <v:textbox>
@@ -27751,7 +27858,7 @@
 </file>
 
 <file path=word/numbering.xml><?xml version="1.0" encoding="utf-8"?>
-<w:numbering xmlns:wpc="http://schemas.microsoft.com/office/word/2010/wordprocessingCanvas" xmlns:cx="http://schemas.microsoft.com/office/drawing/2014/chartex" xmlns:cx1="http://schemas.microsoft.com/office/drawing/2015/9/8/chartex" xmlns:cx2="http://schemas.microsoft.com/office/drawing/2015/10/21/chartex" xmlns:cx3="http://schemas.microsoft.com/office/drawing/2016/5/9/chartex" xmlns:cx4="http://schemas.microsoft.com/office/drawing/2016/5/10/chartex" xmlns:cx5="http://schemas.microsoft.com/office/drawing/2016/5/11/chartex" xmlns:cx6="http://schemas.microsoft.com/office/drawing/2016/5/12/chartex" xmlns:cx7="http://schemas.microsoft.com/office/drawing/2016/5/13/chartex" xmlns:cx8="http://schemas.microsoft.com/office/drawing/2016/5/14/chartex" xmlns:mc="http://schemas.openxmlformats.org/markup-compatibility/2006" xmlns:aink="http://schemas.microsoft.com/office/drawing/2016/ink" xmlns:am3d="http://schemas.microsoft.com/office/drawing/2017/model3d" xmlns:o="urn:schemas-microsoft-com:office:office" xmlns:oel="http://schemas.microsoft.com/office/2019/extlst" xmlns:r="http://schemas.openxmlformats.org/officeDocument/2006/relationships" xmlns:m="http://schemas.openxmlformats.org/officeDocument/2006/math" xmlns:v="urn:schemas-microsoft-com:vml" xmlns:wp14="http://schemas.microsoft.com/office/word/2010/wordprocessingDrawing" xmlns:wp="http://schemas.openxmlformats.org/drawingml/2006/wordprocessingDrawing" xmlns:w10="urn:schemas-microsoft-com:office:word" xmlns:w="http://schemas.openxmlformats.org/wordprocessingml/2006/main" xmlns:w14="http://schemas.microsoft.com/office/word/2010/wordml" xmlns:w15="http://schemas.microsoft.com/office/word/2012/wordml" xmlns:w16cei="http://schemas.microsoft.com/office/word/2026/wordml/cei" xmlns:w16cex="http://schemas.microsoft.com/office/word/2018/wordml/cex" xmlns:w16cid="http://schemas.microsoft.com/office/word/2016/wordml/cid" xmlns:w16="http://schemas.microsoft.com/office/word/2018/wordml" xmlns:w16du="http://schemas.microsoft.com/office/word/2023/wordml/word16du" xmlns:w16sdtdh="http://schemas.microsoft.com/office/word/2020/wordml/sdtdatahash" xmlns:w16sdtfl="http://schemas.microsoft.com/office/word/2024/wordml/sdtformatlock" xmlns:w16se="http://schemas.microsoft.com/office/word/2015/wordml/symex" xmlns:wpg="http://schemas.microsoft.com/office/word/2010/wordprocessingGroup" xmlns:wpi="http://schemas.microsoft.com/office/word/2010/wordprocessingInk" xmlns:wne="http://schemas.microsoft.com/office/word/2006/wordml" xmlns:wps="http://schemas.microsoft.com/office/word/2010/wordprocessingShape" mc:Ignorable="w14 w15 w16se w16cid w16 w16cex w16sdtdh w16sdtfl w16du wp14">
+<w:numbering xmlns:wpc="http://schemas.microsoft.com/office/word/2010/wordprocessingCanvas" xmlns:cx="http://schemas.microsoft.com/office/drawing/2014/chartex" xmlns:cx1="http://schemas.microsoft.com/office/drawing/2015/9/8/chartex" xmlns:cx2="http://schemas.microsoft.com/office/drawing/2015/10/21/chartex" xmlns:cx3="http://schemas.microsoft.com/office/drawing/2016/5/9/chartex" xmlns:cx4="http://schemas.microsoft.com/office/drawing/2016/5/10/chartex" xmlns:cx5="http://schemas.microsoft.com/office/drawing/2016/5/11/chartex" xmlns:cx6="http://schemas.microsoft.com/office/drawing/2016/5/12/chartex" xmlns:cx7="http://schemas.microsoft.com/office/drawing/2016/5/13/chartex" xmlns:cx8="http://schemas.microsoft.com/office/drawing/2016/5/14/chartex" xmlns:mc="http://schemas.openxmlformats.org/markup-compatibility/2006" xmlns:aink="http://schemas.microsoft.com/office/drawing/2016/ink" xmlns:am3d="http://schemas.microsoft.com/office/drawing/2017/model3d" xmlns:o="urn:schemas-microsoft-com:office:office" xmlns:oel="http://schemas.microsoft.com/office/2019/extlst" xmlns:r="http://schemas.openxmlformats.org/officeDocument/2006/relationships" xmlns:m="http://schemas.openxmlformats.org/officeDocument/2006/math" xmlns:v="urn:schemas-microsoft-com:vml" xmlns:wp14="http://schemas.microsoft.com/office/word/2010/wordprocessingDrawing" xmlns:wp="http://schemas.openxmlformats.org/drawingml/2006/wordprocessingDrawing" xmlns:w10="urn:schemas-microsoft-com:office:word" xmlns:w="http://schemas.openxmlformats.org/wordprocessingml/2006/main" xmlns:w14="http://schemas.microsoft.com/office/word/2010/wordml" xmlns:w15="http://schemas.microsoft.com/office/word/2012/wordml" xmlns:w16cex="http://schemas.microsoft.com/office/word/2018/wordml/cex" xmlns:w16cid="http://schemas.microsoft.com/office/word/2016/wordml/cid" xmlns:w16="http://schemas.microsoft.com/office/word/2018/wordml" xmlns:w16du="http://schemas.microsoft.com/office/word/2023/wordml/word16du" xmlns:w16sdtdh="http://schemas.microsoft.com/office/word/2020/wordml/sdtdatahash" xmlns:w16sdtfl="http://schemas.microsoft.com/office/word/2024/wordml/sdtformatlock" xmlns:w16se="http://schemas.microsoft.com/office/word/2015/wordml/symex" xmlns:wpg="http://schemas.microsoft.com/office/word/2010/wordprocessingGroup" xmlns:wpi="http://schemas.microsoft.com/office/word/2010/wordprocessingInk" xmlns:wne="http://schemas.microsoft.com/office/word/2006/wordml" xmlns:wps="http://schemas.microsoft.com/office/word/2010/wordprocessingShape" mc:Ignorable="w14 w15 w16se w16cid w16 w16cex w16sdtdh w16sdtfl w16du wp14">
   <w:abstractNum w:abstractNumId="0" w15:restartNumberingAfterBreak="0">
     <w:nsid w:val="002130F7"/>
     <w:multiLevelType w:val="hybridMultilevel"/>

</xml_diff>